<commit_message>
added a sort button
</commit_message>
<xml_diff>
--- a/study-materials/JavaScript Learning Guide.docx
+++ b/study-materials/JavaScript Learning Guide.docx
@@ -41,8 +41,6 @@
         </w:rPr>
         <w:t xml:space="preserve"> JavaScript Learning Guide </w:t>
       </w:r>
-      <w:bookmarkStart w:id="0" w:name="_GoBack"/>
-      <w:bookmarkEnd w:id="0"/>
     </w:p>
     <w:p>
       <w:pPr>
@@ -532,9 +530,10 @@
           <w:szCs w:val="24"/>
           <w:lang w:eastAsia="en-IN" w:bidi="hi-IN"/>
         </w:rPr>
+        <w:lastRenderedPageBreak/>
         <w:drawing>
           <wp:inline distT="0" distB="0" distL="0" distR="0">
-            <wp:extent cx="4572000" cy="3430800"/>
+            <wp:extent cx="6044540" cy="4535784"/>
             <wp:effectExtent l="0" t="0" r="0" b="0"/>
             <wp:docPr id="23" name="Picture 23" descr="Image"/>
             <wp:cNvGraphicFramePr>
@@ -565,7 +564,7 @@
                   <pic:spPr bwMode="auto">
                     <a:xfrm>
                       <a:off x="0" y="0"/>
-                      <a:ext cx="4572000" cy="3430800"/>
+                      <a:ext cx="6057087" cy="4545199"/>
                     </a:xfrm>
                     <a:prstGeom prst="rect">
                       <a:avLst/>
@@ -585,6 +584,7 @@
     <w:p>
       <w:pPr>
         <w:spacing w:before="100" w:beforeAutospacing="1" w:after="100" w:afterAutospacing="1" w:line="240" w:lineRule="auto"/>
+        <w:ind w:left="-1276"/>
         <w:rPr>
           <w:rFonts w:ascii="Times New Roman" w:eastAsia="Times New Roman" w:hAnsi="Times New Roman" w:cs="Times New Roman"/>
           <w:sz w:val="24"/>
@@ -600,11 +600,10 @@
           <w:szCs w:val="24"/>
           <w:lang w:eastAsia="en-IN" w:bidi="hi-IN"/>
         </w:rPr>
-        <w:lastRenderedPageBreak/>
         <w:drawing>
           <wp:inline distT="0" distB="0" distL="0" distR="0">
-            <wp:extent cx="6590995" cy="3291020"/>
-            <wp:effectExtent l="0" t="0" r="635" b="5080"/>
+            <wp:extent cx="7436622" cy="3713259"/>
+            <wp:effectExtent l="0" t="0" r="0" b="1905"/>
             <wp:docPr id="22" name="Picture 22" descr="Image"/>
             <wp:cNvGraphicFramePr>
               <a:graphicFrameLocks xmlns:a="http://schemas.openxmlformats.org/drawingml/2006/main" noChangeAspect="1"/>
@@ -634,7 +633,7 @@
                   <pic:spPr bwMode="auto">
                     <a:xfrm>
                       <a:off x="0" y="0"/>
-                      <a:ext cx="6608942" cy="3299981"/>
+                      <a:ext cx="7486291" cy="3738060"/>
                     </a:xfrm>
                     <a:prstGeom prst="rect">
                       <a:avLst/>
@@ -669,6 +668,7 @@
           <w:szCs w:val="24"/>
           <w:lang w:eastAsia="en-IN" w:bidi="hi-IN"/>
         </w:rPr>
+        <w:lastRenderedPageBreak/>
         <w:drawing>
           <wp:inline distT="0" distB="0" distL="0" distR="0">
             <wp:extent cx="5947410" cy="2750820"/>
@@ -737,7 +737,7 @@
           <w:lang w:eastAsia="en-IN" w:bidi="hi-IN"/>
         </w:rPr>
         <w:pict>
-          <v:rect id="_x0000_i1032" style="width:0;height:1.5pt" o:hralign="center" o:hrstd="t" o:hr="t" fillcolor="#a0a0a0" stroked="f"/>
+          <v:rect id="_x0000_i1028" style="width:0;height:1.5pt" o:hralign="center" o:hrstd="t" o:hr="t" fillcolor="#a0a0a0" stroked="f"/>
         </w:pict>
       </w:r>
     </w:p>
@@ -901,7 +901,6 @@
           <w:szCs w:val="24"/>
           <w:lang w:eastAsia="en-IN" w:bidi="hi-IN"/>
         </w:rPr>
-        <w:lastRenderedPageBreak/>
         <w:t>Node.js</w:t>
       </w:r>
     </w:p>
@@ -971,7 +970,7 @@
           <w:lang w:eastAsia="en-IN" w:bidi="hi-IN"/>
         </w:rPr>
         <w:pict>
-          <v:rect id="_x0000_i1033" style="width:0;height:1.5pt" o:hralign="center" o:hrstd="t" o:hr="t" fillcolor="#a0a0a0" stroked="f"/>
+          <v:rect id="_x0000_i1029" style="width:0;height:1.5pt" o:hralign="center" o:hrstd="t" o:hr="t" fillcolor="#a0a0a0" stroked="f"/>
         </w:pict>
       </w:r>
     </w:p>
@@ -1113,6 +1112,15 @@
         </w:rPr>
         <w:t xml:space="preserve"> age = 25;</w:t>
       </w:r>
+      <w:r>
+        <w:rPr>
+          <w:rFonts w:ascii="Courier New" w:eastAsia="Times New Roman" w:hAnsi="Courier New" w:cs="Courier New"/>
+          <w:sz w:val="20"/>
+          <w:szCs w:val="20"/>
+          <w:lang w:eastAsia="en-IN" w:bidi="hi-IN"/>
+        </w:rPr>
+        <w:t xml:space="preserve"> //</w:t>
+      </w:r>
     </w:p>
     <w:p>
       <w:pPr>
@@ -1162,6 +1170,15 @@
         </w:rPr>
         <w:t xml:space="preserve"> city = "Delhi";</w:t>
       </w:r>
+      <w:r>
+        <w:rPr>
+          <w:rFonts w:ascii="Courier New" w:eastAsia="Times New Roman" w:hAnsi="Courier New" w:cs="Courier New"/>
+          <w:sz w:val="20"/>
+          <w:szCs w:val="20"/>
+          <w:lang w:eastAsia="en-IN" w:bidi="hi-IN"/>
+        </w:rPr>
+        <w:t xml:space="preserve"> //Global</w:t>
+      </w:r>
     </w:p>
     <w:p>
       <w:pPr>
@@ -1181,7 +1198,7 @@
           <w:lang w:eastAsia="en-IN" w:bidi="hi-IN"/>
         </w:rPr>
         <w:pict>
-          <v:rect id="_x0000_i1034" style="width:0;height:1.5pt" o:hralign="center" o:hrstd="t" o:hr="t" fillcolor="#a0a0a0" stroked="f"/>
+          <v:rect id="_x0000_i1030" style="width:0;height:1.5pt" o:hralign="center" o:hrstd="t" o:hr="t" fillcolor="#a0a0a0" stroked="f"/>
         </w:pict>
       </w:r>
     </w:p>
@@ -1401,6 +1418,7 @@
           <w:szCs w:val="20"/>
           <w:lang w:eastAsia="en-IN" w:bidi="hi-IN"/>
         </w:rPr>
+        <w:lastRenderedPageBreak/>
         <w:t xml:space="preserve">let </w:t>
       </w:r>
       <w:proofErr w:type="spellStart"/>
@@ -1638,7 +1656,7 @@
           <w:lang w:eastAsia="en-IN" w:bidi="hi-IN"/>
         </w:rPr>
         <w:pict>
-          <v:rect id="_x0000_i1035" style="width:0;height:1.5pt" o:hralign="center" o:hrstd="t" o:hr="t" fillcolor="#a0a0a0" stroked="f"/>
+          <v:rect id="_x0000_i1031" style="width:0;height:1.5pt" o:hralign="center" o:hrstd="t" o:hr="t" fillcolor="#a0a0a0" stroked="f"/>
         </w:pict>
       </w:r>
     </w:p>
@@ -1689,7 +1707,7 @@
         </w:rPr>
         <w:drawing>
           <wp:inline distT="0" distB="0" distL="0" distR="0">
-            <wp:extent cx="5086800" cy="2689200"/>
+            <wp:extent cx="7399886" cy="3912042"/>
             <wp:effectExtent l="0" t="0" r="0" b="0"/>
             <wp:docPr id="20" name="Picture 20" descr="Image"/>
             <wp:cNvGraphicFramePr>
@@ -1720,7 +1738,7 @@
                   <pic:spPr bwMode="auto">
                     <a:xfrm>
                       <a:off x="0" y="0"/>
-                      <a:ext cx="5086800" cy="2689200"/>
+                      <a:ext cx="7459575" cy="3943598"/>
                     </a:xfrm>
                     <a:prstGeom prst="rect">
                       <a:avLst/>
@@ -1826,8 +1844,8 @@
         </w:rPr>
         <w:drawing>
           <wp:inline distT="0" distB="0" distL="0" distR="0">
-            <wp:extent cx="3811219" cy="2144046"/>
-            <wp:effectExtent l="0" t="0" r="0" b="8890"/>
+            <wp:extent cx="5889009" cy="3312930"/>
+            <wp:effectExtent l="0" t="0" r="0" b="1905"/>
             <wp:docPr id="18" name="Picture 18" descr="Image"/>
             <wp:cNvGraphicFramePr>
               <a:graphicFrameLocks xmlns:a="http://schemas.openxmlformats.org/drawingml/2006/main" noChangeAspect="1"/>
@@ -1857,7 +1875,7 @@
                   <pic:spPr bwMode="auto">
                     <a:xfrm>
                       <a:off x="0" y="0"/>
-                      <a:ext cx="3815941" cy="2146702"/>
+                      <a:ext cx="5919346" cy="3329997"/>
                     </a:xfrm>
                     <a:prstGeom prst="rect">
                       <a:avLst/>
@@ -1961,7 +1979,7 @@
           <w:lang w:eastAsia="en-IN" w:bidi="hi-IN"/>
         </w:rPr>
         <w:pict>
-          <v:rect id="_x0000_i1040" style="width:0;height:1.5pt" o:hralign="center" o:hrstd="t" o:hr="t" fillcolor="#a0a0a0" stroked="f"/>
+          <v:rect id="_x0000_i1032" style="width:0;height:1.5pt" o:hralign="center" o:hrstd="t" o:hr="t" fillcolor="#a0a0a0" stroked="f"/>
         </w:pict>
       </w:r>
     </w:p>
@@ -2175,7 +2193,7 @@
           <w:lang w:eastAsia="en-IN" w:bidi="hi-IN"/>
         </w:rPr>
         <w:pict>
-          <v:rect id="_x0000_i1041" style="width:0;height:1.5pt" o:hralign="center" o:hrstd="t" o:hr="t" fillcolor="#a0a0a0" stroked="f"/>
+          <v:rect id="_x0000_i1033" style="width:0;height:1.5pt" o:hralign="center" o:hrstd="t" o:hr="t" fillcolor="#a0a0a0" stroked="f"/>
         </w:pict>
       </w:r>
     </w:p>
@@ -2492,7 +2510,7 @@
           <w:lang w:eastAsia="en-IN" w:bidi="hi-IN"/>
         </w:rPr>
         <w:pict>
-          <v:rect id="_x0000_i1042" style="width:0;height:1.5pt" o:hralign="center" o:hrstd="t" o:hr="t" fillcolor="#a0a0a0" stroked="f"/>
+          <v:rect id="_x0000_i1034" style="width:0;height:1.5pt" o:hralign="center" o:hrstd="t" o:hr="t" fillcolor="#a0a0a0" stroked="f"/>
         </w:pict>
       </w:r>
     </w:p>
@@ -2707,7 +2725,7 @@
         </w:rPr>
         <w:lastRenderedPageBreak/>
         <w:pict>
-          <v:rect id="_x0000_i1043" style="width:0;height:1.5pt" o:hralign="center" o:hrstd="t" o:hr="t" fillcolor="#a0a0a0" stroked="f"/>
+          <v:rect id="_x0000_i1035" style="width:0;height:1.5pt" o:hralign="center" o:hrstd="t" o:hr="t" fillcolor="#a0a0a0" stroked="f"/>
         </w:pict>
       </w:r>
     </w:p>
@@ -3047,7 +3065,7 @@
           <w:lang w:eastAsia="en-IN" w:bidi="hi-IN"/>
         </w:rPr>
         <w:pict>
-          <v:rect id="_x0000_i1048" style="width:0;height:1.5pt" o:hralign="center" o:hrstd="t" o:hr="t" fillcolor="#a0a0a0" stroked="f"/>
+          <v:rect id="_x0000_i1036" style="width:0;height:1.5pt" o:hralign="center" o:hrstd="t" o:hr="t" fillcolor="#a0a0a0" stroked="f"/>
         </w:pict>
       </w:r>
     </w:p>
@@ -3319,7 +3337,7 @@
           <w:lang w:eastAsia="en-IN" w:bidi="hi-IN"/>
         </w:rPr>
         <w:pict>
-          <v:rect id="_x0000_i1049" style="width:0;height:1.5pt" o:hralign="center" o:hrstd="t" o:hr="t" fillcolor="#a0a0a0" stroked="f"/>
+          <v:rect id="_x0000_i1037" style="width:0;height:1.5pt" o:hralign="center" o:hrstd="t" o:hr="t" fillcolor="#a0a0a0" stroked="f"/>
         </w:pict>
       </w:r>
     </w:p>
@@ -3437,7 +3455,7 @@
           <w:lang w:eastAsia="en-IN" w:bidi="hi-IN"/>
         </w:rPr>
         <w:pict>
-          <v:rect id="_x0000_i1050" style="width:0;height:1.5pt" o:hralign="center" o:hrstd="t" o:hr="t" fillcolor="#a0a0a0" stroked="f"/>
+          <v:rect id="_x0000_i1038" style="width:0;height:1.5pt" o:hralign="center" o:hrstd="t" o:hr="t" fillcolor="#a0a0a0" stroked="f"/>
         </w:pict>
       </w:r>
     </w:p>
@@ -3489,8 +3507,8 @@
         <w:lastRenderedPageBreak/>
         <w:drawing>
           <wp:inline distT="0" distB="0" distL="0" distR="0">
-            <wp:extent cx="11433810" cy="5478780"/>
-            <wp:effectExtent l="0" t="0" r="0" b="7620"/>
+            <wp:extent cx="5159829" cy="2473265"/>
+            <wp:effectExtent l="0" t="0" r="3175" b="3810"/>
             <wp:docPr id="12" name="Picture 12" descr="Image"/>
             <wp:cNvGraphicFramePr>
               <a:graphicFrameLocks xmlns:a="http://schemas.openxmlformats.org/drawingml/2006/main" noChangeAspect="1"/>
@@ -3520,7 +3538,7 @@
                   <pic:spPr bwMode="auto">
                     <a:xfrm>
                       <a:off x="0" y="0"/>
-                      <a:ext cx="11433810" cy="5478780"/>
+                      <a:ext cx="5183321" cy="2484526"/>
                     </a:xfrm>
                     <a:prstGeom prst="rect">
                       <a:avLst/>
@@ -3555,96 +3573,9 @@
           <w:szCs w:val="24"/>
           <w:lang w:eastAsia="en-IN" w:bidi="hi-IN"/>
         </w:rPr>
-        <mc:AlternateContent>
-          <mc:Choice Requires="wps">
-            <w:drawing>
-              <wp:inline distT="0" distB="0" distL="0" distR="0">
-                <wp:extent cx="307340" cy="307340"/>
-                <wp:effectExtent l="0" t="0" r="0" b="0"/>
-                <wp:docPr id="11" name="Rectangle 11" descr="Image"/>
-                <wp:cNvGraphicFramePr>
-                  <a:graphicFrameLocks xmlns:a="http://schemas.openxmlformats.org/drawingml/2006/main" noChangeAspect="1"/>
-                </wp:cNvGraphicFramePr>
-                <a:graphic xmlns:a="http://schemas.openxmlformats.org/drawingml/2006/main">
-                  <a:graphicData uri="http://schemas.microsoft.com/office/word/2010/wordprocessingShape">
-                    <wps:wsp>
-                      <wps:cNvSpPr>
-                        <a:spLocks noChangeAspect="1" noChangeArrowheads="1"/>
-                      </wps:cNvSpPr>
-                      <wps:spPr bwMode="auto">
-                        <a:xfrm>
-                          <a:off x="0" y="0"/>
-                          <a:ext cx="307340" cy="307340"/>
-                        </a:xfrm>
-                        <a:prstGeom prst="rect">
-                          <a:avLst/>
-                        </a:prstGeom>
-                        <a:noFill/>
-                        <a:ln>
-                          <a:noFill/>
-                        </a:ln>
-                        <a:extLst>
-                          <a:ext uri="{909E8E84-426E-40DD-AFC4-6F175D3DCCD1}">
-                            <a14:hiddenFill xmlns:a14="http://schemas.microsoft.com/office/drawing/2010/main">
-                              <a:solidFill>
-                                <a:srgbClr val="FFFFFF"/>
-                              </a:solidFill>
-                            </a14:hiddenFill>
-                          </a:ext>
-                          <a:ext uri="{91240B29-F687-4F45-9708-019B960494DF}">
-                            <a14:hiddenLine xmlns:a14="http://schemas.microsoft.com/office/drawing/2010/main" w="9525">
-                              <a:solidFill>
-                                <a:srgbClr val="000000"/>
-                              </a:solidFill>
-                              <a:miter lim="800000"/>
-                              <a:headEnd/>
-                              <a:tailEnd/>
-                            </a14:hiddenLine>
-                          </a:ext>
-                        </a:extLst>
-                      </wps:spPr>
-                      <wps:bodyPr rot="0" vert="horz" wrap="square" lIns="91440" tIns="45720" rIns="91440" bIns="45720" anchor="t" anchorCtr="0" upright="1">
-                        <a:noAutofit/>
-                      </wps:bodyPr>
-                    </wps:wsp>
-                  </a:graphicData>
-                </a:graphic>
-              </wp:inline>
-            </w:drawing>
-          </mc:Choice>
-          <mc:Fallback>
-            <w:pict>
-              <v:rect w14:anchorId="58C1FAC5" id="Rectangle 11" o:spid="_x0000_s1026" alt="Image" style="width:24.2pt;height:24.2pt;visibility:visible;mso-wrap-style:square;mso-left-percent:-10001;mso-top-percent:-10001;mso-position-horizontal:absolute;mso-position-horizontal-relative:char;mso-position-vertical:absolute;mso-position-vertical-relative:line;mso-left-percent:-10001;mso-top-percent:-10001;v-text-anchor:top" o:gfxdata="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" filled="f" stroked="f">
-                <o:lock v:ext="edit" aspectratio="t"/>
-                <w10:anchorlock/>
-              </v:rect>
-            </w:pict>
-          </mc:Fallback>
-        </mc:AlternateContent>
-      </w:r>
-    </w:p>
-    <w:p>
-      <w:pPr>
-        <w:spacing w:before="100" w:beforeAutospacing="1" w:after="100" w:afterAutospacing="1" w:line="240" w:lineRule="auto"/>
-        <w:rPr>
-          <w:rFonts w:ascii="Times New Roman" w:eastAsia="Times New Roman" w:hAnsi="Times New Roman" w:cs="Times New Roman"/>
-          <w:sz w:val="24"/>
-          <w:szCs w:val="24"/>
-          <w:lang w:eastAsia="en-IN" w:bidi="hi-IN"/>
-        </w:rPr>
-      </w:pPr>
-      <w:r>
-        <w:rPr>
-          <w:rFonts w:ascii="Times New Roman" w:eastAsia="Times New Roman" w:hAnsi="Times New Roman" w:cs="Times New Roman"/>
-          <w:noProof/>
-          <w:sz w:val="24"/>
-          <w:szCs w:val="24"/>
-          <w:lang w:eastAsia="en-IN" w:bidi="hi-IN"/>
-        </w:rPr>
-        <w:lastRenderedPageBreak/>
         <w:drawing>
           <wp:inline distT="0" distB="0" distL="0" distR="0">
-            <wp:extent cx="7622540" cy="4762500"/>
+            <wp:extent cx="5079442" cy="3174652"/>
             <wp:effectExtent l="0" t="0" r="0" b="0"/>
             <wp:docPr id="10" name="Picture 10" descr="Image"/>
             <wp:cNvGraphicFramePr>
@@ -3675,7 +3606,7 @@
                   <pic:spPr bwMode="auto">
                     <a:xfrm>
                       <a:off x="0" y="0"/>
-                      <a:ext cx="7622540" cy="4762500"/>
+                      <a:ext cx="5170001" cy="3231251"/>
                     </a:xfrm>
                     <a:prstGeom prst="rect">
                       <a:avLst/>
@@ -3796,7 +3727,7 @@
           <w:lang w:eastAsia="en-IN" w:bidi="hi-IN"/>
         </w:rPr>
         <w:pict>
-          <v:rect id="_x0000_i1055" style="width:0;height:1.5pt" o:hralign="center" o:hrstd="t" o:hr="t" fillcolor="#a0a0a0" stroked="f"/>
+          <v:rect id="_x0000_i1039" style="width:0;height:1.5pt" o:hralign="center" o:hrstd="t" o:hr="t" fillcolor="#a0a0a0" stroked="f"/>
         </w:pict>
       </w:r>
     </w:p>
@@ -3986,7 +3917,7 @@
           <w:lang w:eastAsia="en-IN" w:bidi="hi-IN"/>
         </w:rPr>
         <w:pict>
-          <v:rect id="_x0000_i1056" style="width:0;height:1.5pt" o:hralign="center" o:hrstd="t" o:hr="t" fillcolor="#a0a0a0" stroked="f"/>
+          <v:rect id="_x0000_i1040" style="width:0;height:1.5pt" o:hralign="center" o:hrstd="t" o:hr="t" fillcolor="#a0a0a0" stroked="f"/>
         </w:pict>
       </w:r>
     </w:p>
@@ -4050,6 +3981,7 @@
           <w:szCs w:val="20"/>
           <w:lang w:eastAsia="en-IN" w:bidi="hi-IN"/>
         </w:rPr>
+        <w:lastRenderedPageBreak/>
         <w:t>let user = {</w:t>
       </w:r>
     </w:p>
@@ -4251,9 +4183,8 @@
           <w:szCs w:val="24"/>
           <w:lang w:eastAsia="en-IN" w:bidi="hi-IN"/>
         </w:rPr>
-        <w:lastRenderedPageBreak/>
         <w:pict>
-          <v:rect id="_x0000_i1057" style="width:0;height:1.5pt" o:hralign="center" o:hrstd="t" o:hr="t" fillcolor="#a0a0a0" stroked="f"/>
+          <v:rect id="_x0000_i1041" style="width:0;height:1.5pt" o:hralign="center" o:hrstd="t" o:hr="t" fillcolor="#a0a0a0" stroked="f"/>
         </w:pict>
       </w:r>
     </w:p>
@@ -4393,7 +4324,7 @@
           <w:lang w:eastAsia="en-IN" w:bidi="hi-IN"/>
         </w:rPr>
         <w:pict>
-          <v:rect id="_x0000_i1058" style="width:0;height:1.5pt" o:hralign="center" o:hrstd="t" o:hr="t" fillcolor="#a0a0a0" stroked="f"/>
+          <v:rect id="_x0000_i1042" style="width:0;height:1.5pt" o:hralign="center" o:hrstd="t" o:hr="t" fillcolor="#a0a0a0" stroked="f"/>
         </w:pict>
       </w:r>
     </w:p>
@@ -4427,26 +4358,27 @@
     <w:p>
       <w:pPr>
         <w:spacing w:before="100" w:beforeAutospacing="1" w:after="100" w:afterAutospacing="1" w:line="240" w:lineRule="auto"/>
-        <w:rPr>
-          <w:rFonts w:ascii="Times New Roman" w:eastAsia="Times New Roman" w:hAnsi="Times New Roman" w:cs="Times New Roman"/>
-          <w:sz w:val="24"/>
-          <w:szCs w:val="24"/>
-          <w:lang w:eastAsia="en-IN" w:bidi="hi-IN"/>
-        </w:rPr>
-      </w:pPr>
-      <w:r>
-        <w:rPr>
-          <w:rFonts w:ascii="Times New Roman" w:eastAsia="Times New Roman" w:hAnsi="Times New Roman" w:cs="Times New Roman"/>
+        <w:outlineLvl w:val="0"/>
+        <w:rPr>
+          <w:rFonts w:ascii="Times New Roman" w:eastAsia="Times New Roman" w:hAnsi="Times New Roman" w:cs="Times New Roman"/>
+          <w:b/>
+          <w:bCs/>
+          <w:kern w:val="36"/>
+          <w:sz w:val="48"/>
+          <w:szCs w:val="48"/>
+          <w:lang w:eastAsia="en-IN" w:bidi="hi-IN"/>
+        </w:rPr>
+      </w:pPr>
+      <w:r>
+        <w:rPr>
           <w:noProof/>
-          <w:sz w:val="24"/>
-          <w:szCs w:val="24"/>
           <w:lang w:eastAsia="en-IN" w:bidi="hi-IN"/>
         </w:rPr>
         <w:drawing>
           <wp:inline distT="0" distB="0" distL="0" distR="0">
-            <wp:extent cx="6876415" cy="4359910"/>
-            <wp:effectExtent l="0" t="0" r="635" b="2540"/>
-            <wp:docPr id="8" name="Picture 8" descr="Image"/>
+            <wp:extent cx="5731510" cy="4029516"/>
+            <wp:effectExtent l="0" t="0" r="2540" b="9525"/>
+            <wp:docPr id="11" name="Picture 11" descr="https://miro.medium.com/v2/resize:fit:875/1*9oWl_UOcgqyUHa5KRo01Zg.gif"/>
             <wp:cNvGraphicFramePr>
               <a:graphicFrameLocks xmlns:a="http://schemas.openxmlformats.org/drawingml/2006/main" noChangeAspect="1"/>
             </wp:cNvGraphicFramePr>
@@ -4454,7 +4386,7 @@
               <a:graphicData uri="http://schemas.openxmlformats.org/drawingml/2006/picture">
                 <pic:pic xmlns:pic="http://schemas.openxmlformats.org/drawingml/2006/picture">
                   <pic:nvPicPr>
-                    <pic:cNvPr id="0" name="Picture 35" descr="Image"/>
+                    <pic:cNvPr id="0" name="Picture 33" descr="https://miro.medium.com/v2/resize:fit:875/1*9oWl_UOcgqyUHa5KRo01Zg.gif"/>
                     <pic:cNvPicPr>
                       <a:picLocks noChangeAspect="1" noChangeArrowheads="1"/>
                     </pic:cNvPicPr>
@@ -4475,7 +4407,7 @@
                   <pic:spPr bwMode="auto">
                     <a:xfrm>
                       <a:off x="0" y="0"/>
-                      <a:ext cx="6876415" cy="4359910"/>
+                      <a:ext cx="5731510" cy="4029516"/>
                     </a:xfrm>
                     <a:prstGeom prst="rect">
                       <a:avLst/>
@@ -4511,6 +4443,74 @@
           <w:lang w:eastAsia="en-IN" w:bidi="hi-IN"/>
         </w:rPr>
         <w:lastRenderedPageBreak/>
+        <w:drawing>
+          <wp:inline distT="0" distB="0" distL="0" distR="0">
+            <wp:extent cx="4129200" cy="2617200"/>
+            <wp:effectExtent l="0" t="0" r="5080" b="0"/>
+            <wp:docPr id="8" name="Picture 8" descr="Image"/>
+            <wp:cNvGraphicFramePr>
+              <a:graphicFrameLocks xmlns:a="http://schemas.openxmlformats.org/drawingml/2006/main" noChangeAspect="1"/>
+            </wp:cNvGraphicFramePr>
+            <a:graphic xmlns:a="http://schemas.openxmlformats.org/drawingml/2006/main">
+              <a:graphicData uri="http://schemas.openxmlformats.org/drawingml/2006/picture">
+                <pic:pic xmlns:pic="http://schemas.openxmlformats.org/drawingml/2006/picture">
+                  <pic:nvPicPr>
+                    <pic:cNvPr id="0" name="Picture 35" descr="Image"/>
+                    <pic:cNvPicPr>
+                      <a:picLocks noChangeAspect="1" noChangeArrowheads="1"/>
+                    </pic:cNvPicPr>
+                  </pic:nvPicPr>
+                  <pic:blipFill>
+                    <a:blip r:embed="rId19">
+                      <a:extLst>
+                        <a:ext uri="{28A0092B-C50C-407E-A947-70E740481C1C}">
+                          <a14:useLocalDpi xmlns:a14="http://schemas.microsoft.com/office/drawing/2010/main" val="0"/>
+                        </a:ext>
+                      </a:extLst>
+                    </a:blip>
+                    <a:srcRect/>
+                    <a:stretch>
+                      <a:fillRect/>
+                    </a:stretch>
+                  </pic:blipFill>
+                  <pic:spPr bwMode="auto">
+                    <a:xfrm>
+                      <a:off x="0" y="0"/>
+                      <a:ext cx="4129200" cy="2617200"/>
+                    </a:xfrm>
+                    <a:prstGeom prst="rect">
+                      <a:avLst/>
+                    </a:prstGeom>
+                    <a:noFill/>
+                    <a:ln>
+                      <a:noFill/>
+                    </a:ln>
+                  </pic:spPr>
+                </pic:pic>
+              </a:graphicData>
+            </a:graphic>
+          </wp:inline>
+        </w:drawing>
+      </w:r>
+    </w:p>
+    <w:p>
+      <w:pPr>
+        <w:spacing w:before="100" w:beforeAutospacing="1" w:after="100" w:afterAutospacing="1" w:line="240" w:lineRule="auto"/>
+        <w:rPr>
+          <w:rFonts w:ascii="Times New Roman" w:eastAsia="Times New Roman" w:hAnsi="Times New Roman" w:cs="Times New Roman"/>
+          <w:sz w:val="24"/>
+          <w:szCs w:val="24"/>
+          <w:lang w:eastAsia="en-IN" w:bidi="hi-IN"/>
+        </w:rPr>
+      </w:pPr>
+      <w:r>
+        <w:rPr>
+          <w:rFonts w:ascii="Times New Roman" w:eastAsia="Times New Roman" w:hAnsi="Times New Roman" w:cs="Times New Roman"/>
+          <w:noProof/>
+          <w:sz w:val="24"/>
+          <w:szCs w:val="24"/>
+          <w:lang w:eastAsia="en-IN" w:bidi="hi-IN"/>
+        </w:rPr>
         <w:drawing>
           <wp:inline distT="0" distB="0" distL="0" distR="0">
             <wp:extent cx="4630420" cy="2531110"/>
@@ -4529,7 +4529,7 @@
                     </pic:cNvPicPr>
                   </pic:nvPicPr>
                   <pic:blipFill>
-                    <a:blip r:embed="rId19">
+                    <a:blip r:embed="rId20">
                       <a:extLst>
                         <a:ext uri="{28A0092B-C50C-407E-A947-70E740481C1C}">
                           <a14:useLocalDpi xmlns:a14="http://schemas.microsoft.com/office/drawing/2010/main" val="0"/>
@@ -4665,6 +4665,7 @@
           <w:szCs w:val="24"/>
           <w:lang w:eastAsia="en-IN" w:bidi="hi-IN"/>
         </w:rPr>
+        <w:lastRenderedPageBreak/>
         <w:drawing>
           <wp:inline distT="0" distB="0" distL="0" distR="0">
             <wp:extent cx="3811270" cy="3496945"/>
@@ -4683,7 +4684,7 @@
                     </pic:cNvPicPr>
                   </pic:nvPicPr>
                   <pic:blipFill>
-                    <a:blip r:embed="rId20">
+                    <a:blip r:embed="rId21">
                       <a:extLst>
                         <a:ext uri="{28A0092B-C50C-407E-A947-70E740481C1C}">
                           <a14:useLocalDpi xmlns:a14="http://schemas.microsoft.com/office/drawing/2010/main" val="0"/>
@@ -4733,7 +4734,7 @@
           <w:lang w:eastAsia="en-IN" w:bidi="hi-IN"/>
         </w:rPr>
         <w:pict>
-          <v:rect id="_x0000_i1063" style="width:0;height:1.5pt" o:hralign="center" o:hrstd="t" o:hr="t" fillcolor="#a0a0a0" stroked="f"/>
+          <v:rect id="_x0000_i1043" style="width:0;height:1.5pt" o:hralign="center" o:hrstd="t" o:hr="t" fillcolor="#a0a0a0" stroked="f"/>
         </w:pict>
       </w:r>
     </w:p>
@@ -5018,7 +5019,7 @@
           <w:lang w:eastAsia="en-IN" w:bidi="hi-IN"/>
         </w:rPr>
         <w:pict>
-          <v:rect id="_x0000_i1064" style="width:0;height:1.5pt" o:hralign="center" o:hrstd="t" o:hr="t" fillcolor="#a0a0a0" stroked="f"/>
+          <v:rect id="_x0000_i1044" style="width:0;height:1.5pt" o:hralign="center" o:hrstd="t" o:hr="t" fillcolor="#a0a0a0" stroked="f"/>
         </w:pict>
       </w:r>
     </w:p>
@@ -5046,7 +5047,6 @@
           <w:szCs w:val="48"/>
           <w:lang w:eastAsia="en-IN" w:bidi="hi-IN"/>
         </w:rPr>
-        <w:lastRenderedPageBreak/>
         <w:t>11. ES6+ Features</w:t>
       </w:r>
     </w:p>
@@ -5155,7 +5155,7 @@
           <w:lang w:eastAsia="en-IN" w:bidi="hi-IN"/>
         </w:rPr>
         <w:pict>
-          <v:rect id="_x0000_i1065" style="width:0;height:1.5pt" o:hralign="center" o:hrstd="t" o:hr="t" fillcolor="#a0a0a0" stroked="f"/>
+          <v:rect id="_x0000_i1045" style="width:0;height:1.5pt" o:hralign="center" o:hrstd="t" o:hr="t" fillcolor="#a0a0a0" stroked="f"/>
         </w:pict>
       </w:r>
     </w:p>
@@ -5318,7 +5318,7 @@
           <w:lang w:eastAsia="en-IN" w:bidi="hi-IN"/>
         </w:rPr>
         <w:pict>
-          <v:rect id="_x0000_i1066" style="width:0;height:1.5pt" o:hralign="center" o:hrstd="t" o:hr="t" fillcolor="#a0a0a0" stroked="f"/>
+          <v:rect id="_x0000_i1046" style="width:0;height:1.5pt" o:hralign="center" o:hrstd="t" o:hr="t" fillcolor="#a0a0a0" stroked="f"/>
         </w:pict>
       </w:r>
     </w:p>
@@ -5452,7 +5452,7 @@
           <w:lang w:eastAsia="en-IN" w:bidi="hi-IN"/>
         </w:rPr>
         <w:pict>
-          <v:rect id="_x0000_i1067" style="width:0;height:1.5pt" o:hralign="center" o:hrstd="t" o:hr="t" fillcolor="#a0a0a0" stroked="f"/>
+          <v:rect id="_x0000_i1047" style="width:0;height:1.5pt" o:hralign="center" o:hrstd="t" o:hr="t" fillcolor="#a0a0a0" stroked="f"/>
         </w:pict>
       </w:r>
     </w:p>
@@ -5480,6 +5480,7 @@
           <w:szCs w:val="48"/>
           <w:lang w:eastAsia="en-IN" w:bidi="hi-IN"/>
         </w:rPr>
+        <w:lastRenderedPageBreak/>
         <w:t>12. Asynchronous JavaScript</w:t>
       </w:r>
     </w:p>
@@ -5664,7 +5665,7 @@
           <w:lang w:eastAsia="en-IN" w:bidi="hi-IN"/>
         </w:rPr>
         <w:pict>
-          <v:rect id="_x0000_i1068" style="width:0;height:1.5pt" o:hralign="center" o:hrstd="t" o:hr="t" fillcolor="#a0a0a0" stroked="f"/>
+          <v:rect id="_x0000_i1048" style="width:0;height:1.5pt" o:hralign="center" o:hrstd="t" o:hr="t" fillcolor="#a0a0a0" stroked="f"/>
         </w:pict>
       </w:r>
     </w:p>
@@ -5925,7 +5926,7 @@
           <w:lang w:eastAsia="en-IN" w:bidi="hi-IN"/>
         </w:rPr>
         <w:pict>
-          <v:rect id="_x0000_i1069" style="width:0;height:1.5pt" o:hralign="center" o:hrstd="t" o:hr="t" fillcolor="#a0a0a0" stroked="f"/>
+          <v:rect id="_x0000_i1049" style="width:0;height:1.5pt" o:hralign="center" o:hrstd="t" o:hr="t" fillcolor="#a0a0a0" stroked="f"/>
         </w:pict>
       </w:r>
     </w:p>
@@ -6239,7 +6240,7 @@
           <w:lang w:eastAsia="en-IN" w:bidi="hi-IN"/>
         </w:rPr>
         <w:pict>
-          <v:rect id="_x0000_i1070" style="width:0;height:1.5pt" o:hralign="center" o:hrstd="t" o:hr="t" fillcolor="#a0a0a0" stroked="f"/>
+          <v:rect id="_x0000_i1050" style="width:0;height:1.5pt" o:hralign="center" o:hrstd="t" o:hr="t" fillcolor="#a0a0a0" stroked="f"/>
         </w:pict>
       </w:r>
     </w:p>
@@ -6294,6 +6295,7 @@
           <w:lang w:eastAsia="en-IN" w:bidi="hi-IN"/>
         </w:rPr>
       </w:pPr>
+      <w:bookmarkStart w:id="0" w:name="_GoBack"/>
       <w:r>
         <w:rPr>
           <w:rFonts w:ascii="Times New Roman" w:eastAsia="Times New Roman" w:hAnsi="Times New Roman" w:cs="Times New Roman"/>
@@ -6305,8 +6307,8 @@
         <w:lastRenderedPageBreak/>
         <w:drawing>
           <wp:inline distT="0" distB="0" distL="0" distR="0">
-            <wp:extent cx="8383270" cy="4718050"/>
-            <wp:effectExtent l="0" t="0" r="0" b="6350"/>
+            <wp:extent cx="6384897" cy="3592876"/>
+            <wp:effectExtent l="0" t="0" r="0" b="7620"/>
             <wp:docPr id="4" name="Picture 4" descr="Image"/>
             <wp:cNvGraphicFramePr>
               <a:graphicFrameLocks xmlns:a="http://schemas.openxmlformats.org/drawingml/2006/main" noChangeAspect="1"/>
@@ -6321,7 +6323,7 @@
                     </pic:cNvPicPr>
                   </pic:nvPicPr>
                   <pic:blipFill>
-                    <a:blip r:embed="rId21">
+                    <a:blip r:embed="rId22">
                       <a:extLst>
                         <a:ext uri="{28A0092B-C50C-407E-A947-70E740481C1C}">
                           <a14:useLocalDpi xmlns:a14="http://schemas.microsoft.com/office/drawing/2010/main" val="0"/>
@@ -6336,7 +6338,7 @@
                   <pic:spPr bwMode="auto">
                     <a:xfrm>
                       <a:off x="0" y="0"/>
-                      <a:ext cx="8383270" cy="4718050"/>
+                      <a:ext cx="6405246" cy="3604327"/>
                     </a:xfrm>
                     <a:prstGeom prst="rect">
                       <a:avLst/>
@@ -6352,6 +6354,7 @@
           </wp:inline>
         </w:drawing>
       </w:r>
+      <w:bookmarkEnd w:id="0"/>
     </w:p>
     <w:p>
       <w:pPr>
@@ -6475,7 +6478,7 @@
                     </pic:cNvPicPr>
                   </pic:nvPicPr>
                   <pic:blipFill>
-                    <a:blip r:embed="rId22">
+                    <a:blip r:embed="rId23">
                       <a:extLst>
                         <a:ext uri="{28A0092B-C50C-407E-A947-70E740481C1C}">
                           <a14:useLocalDpi xmlns:a14="http://schemas.microsoft.com/office/drawing/2010/main" val="0"/>
@@ -6544,7 +6547,7 @@
                     </pic:cNvPicPr>
                   </pic:nvPicPr>
                   <pic:blipFill>
-                    <a:blip r:embed="rId23">
+                    <a:blip r:embed="rId24">
                       <a:extLst>
                         <a:ext uri="{28A0092B-C50C-407E-A947-70E740481C1C}">
                           <a14:useLocalDpi xmlns:a14="http://schemas.microsoft.com/office/drawing/2010/main" val="0"/>
@@ -6594,7 +6597,7 @@
           <w:lang w:eastAsia="en-IN" w:bidi="hi-IN"/>
         </w:rPr>
         <w:pict>
-          <v:rect id="_x0000_i1075" style="width:0;height:1.5pt" o:hralign="center" o:hrstd="t" o:hr="t" fillcolor="#a0a0a0" stroked="f"/>
+          <v:rect id="_x0000_i1051" style="width:0;height:1.5pt" o:hralign="center" o:hrstd="t" o:hr="t" fillcolor="#a0a0a0" stroked="f"/>
         </w:pict>
       </w:r>
     </w:p>
@@ -6853,7 +6856,7 @@
           <w:lang w:eastAsia="en-IN" w:bidi="hi-IN"/>
         </w:rPr>
         <w:pict>
-          <v:rect id="_x0000_i1076" style="width:0;height:1.5pt" o:hralign="center" o:hrstd="t" o:hr="t" fillcolor="#a0a0a0" stroked="f"/>
+          <v:rect id="_x0000_i1052" style="width:0;height:1.5pt" o:hralign="center" o:hrstd="t" o:hr="t" fillcolor="#a0a0a0" stroked="f"/>
         </w:pict>
       </w:r>
     </w:p>
@@ -7076,7 +7079,7 @@
           <w:lang w:eastAsia="en-IN" w:bidi="hi-IN"/>
         </w:rPr>
         <w:pict>
-          <v:rect id="_x0000_i1077" style="width:0;height:1.5pt" o:hralign="center" o:hrstd="t" o:hr="t" fillcolor="#a0a0a0" stroked="f"/>
+          <v:rect id="_x0000_i1053" style="width:0;height:1.5pt" o:hralign="center" o:hrstd="t" o:hr="t" fillcolor="#a0a0a0" stroked="f"/>
         </w:pict>
       </w:r>
     </w:p>
@@ -7242,7 +7245,7 @@
           <w:lang w:eastAsia="en-IN" w:bidi="hi-IN"/>
         </w:rPr>
         <w:pict>
-          <v:rect id="_x0000_i1078" style="width:0;height:1.5pt" o:hralign="center" o:hrstd="t" o:hr="t" fillcolor="#a0a0a0" stroked="f"/>
+          <v:rect id="_x0000_i1054" style="width:0;height:1.5pt" o:hralign="center" o:hrstd="t" o:hr="t" fillcolor="#a0a0a0" stroked="f"/>
         </w:pict>
       </w:r>
     </w:p>
@@ -7564,7 +7567,7 @@
           <w:lang w:eastAsia="en-IN" w:bidi="hi-IN"/>
         </w:rPr>
         <w:pict>
-          <v:rect id="_x0000_i1079" style="width:0;height:1.5pt" o:hralign="center" o:hrstd="t" o:hr="t" fillcolor="#a0a0a0" stroked="f"/>
+          <v:rect id="_x0000_i1055" style="width:0;height:1.5pt" o:hralign="center" o:hrstd="t" o:hr="t" fillcolor="#a0a0a0" stroked="f"/>
         </w:pict>
       </w:r>
     </w:p>
@@ -7776,7 +7779,7 @@
           <w:lang w:eastAsia="en-IN" w:bidi="hi-IN"/>
         </w:rPr>
         <w:pict>
-          <v:rect id="_x0000_i1081" style="width:0;height:1.5pt" o:hralign="center" o:hrstd="t" o:hr="t" fillcolor="#a0a0a0" stroked="f"/>
+          <v:rect id="_x0000_i1056" style="width:0;height:1.5pt" o:hralign="center" o:hrstd="t" o:hr="t" fillcolor="#a0a0a0" stroked="f"/>
         </w:pict>
       </w:r>
     </w:p>

</xml_diff>

<commit_message>
file handling wiht node.js
</commit_message>
<xml_diff>
--- a/study-materials/JavaScript Learning Guide.docx
+++ b/study-materials/JavaScript Learning Guide.docx
@@ -4767,6 +4767,179 @@
     </w:p>
     <w:p>
       <w:pPr>
+        <w:shd w:val="clear" w:color="auto" w:fill="F5F5F5"/>
+        <w:spacing w:after="0" w:line="285" w:lineRule="atLeast"/>
+        <w:rPr>
+          <w:rFonts w:ascii="Consolas" w:eastAsia="Times New Roman" w:hAnsi="Consolas" w:cs="Times New Roman"/>
+          <w:color w:val="333333"/>
+          <w:sz w:val="21"/>
+          <w:szCs w:val="21"/>
+          <w:lang w:eastAsia="en-IN" w:bidi="hi-IN"/>
+        </w:rPr>
+      </w:pPr>
+      <w:r>
+        <w:rPr>
+          <w:rFonts w:ascii="Consolas" w:eastAsia="Times New Roman" w:hAnsi="Consolas" w:cs="Times New Roman"/>
+          <w:color w:val="91B3E0"/>
+          <w:sz w:val="21"/>
+          <w:szCs w:val="21"/>
+          <w:lang w:eastAsia="en-IN" w:bidi="hi-IN"/>
+        </w:rPr>
+        <w:t>&lt;</w:t>
+      </w:r>
+      <w:r>
+        <w:rPr>
+          <w:rFonts w:ascii="Consolas" w:eastAsia="Times New Roman" w:hAnsi="Consolas" w:cs="Times New Roman"/>
+          <w:color w:val="4B69C6"/>
+          <w:sz w:val="21"/>
+          <w:szCs w:val="21"/>
+          <w:lang w:eastAsia="en-IN" w:bidi="hi-IN"/>
+        </w:rPr>
+        <w:t>input</w:t>
+      </w:r>
+      <w:r>
+        <w:rPr>
+          <w:rFonts w:ascii="Consolas" w:eastAsia="Times New Roman" w:hAnsi="Consolas" w:cs="Times New Roman"/>
+          <w:color w:val="91B3E0"/>
+          <w:sz w:val="21"/>
+          <w:szCs w:val="21"/>
+          <w:lang w:eastAsia="en-IN" w:bidi="hi-IN"/>
+        </w:rPr>
+        <w:t xml:space="preserve"> </w:t>
+      </w:r>
+      <w:r>
+        <w:rPr>
+          <w:rFonts w:ascii="Consolas" w:eastAsia="Times New Roman" w:hAnsi="Consolas" w:cs="Times New Roman"/>
+          <w:i/>
+          <w:iCs/>
+          <w:color w:val="8190A0"/>
+          <w:sz w:val="21"/>
+          <w:szCs w:val="21"/>
+          <w:lang w:eastAsia="en-IN" w:bidi="hi-IN"/>
+        </w:rPr>
+        <w:t>type</w:t>
+      </w:r>
+      <w:r>
+        <w:rPr>
+          <w:rFonts w:ascii="Consolas" w:eastAsia="Times New Roman" w:hAnsi="Consolas" w:cs="Times New Roman"/>
+          <w:color w:val="777777"/>
+          <w:sz w:val="21"/>
+          <w:szCs w:val="21"/>
+          <w:lang w:eastAsia="en-IN" w:bidi="hi-IN"/>
+        </w:rPr>
+        <w:t>="</w:t>
+      </w:r>
+      <w:r>
+        <w:rPr>
+          <w:rFonts w:ascii="Consolas" w:eastAsia="Times New Roman" w:hAnsi="Consolas" w:cs="Times New Roman"/>
+          <w:color w:val="448C27"/>
+          <w:sz w:val="21"/>
+          <w:szCs w:val="21"/>
+          <w:lang w:eastAsia="en-IN" w:bidi="hi-IN"/>
+        </w:rPr>
+        <w:t>text</w:t>
+      </w:r>
+      <w:r>
+        <w:rPr>
+          <w:rFonts w:ascii="Consolas" w:eastAsia="Times New Roman" w:hAnsi="Consolas" w:cs="Times New Roman"/>
+          <w:color w:val="777777"/>
+          <w:sz w:val="21"/>
+          <w:szCs w:val="21"/>
+          <w:lang w:eastAsia="en-IN" w:bidi="hi-IN"/>
+        </w:rPr>
+        <w:t>"</w:t>
+      </w:r>
+      <w:r>
+        <w:rPr>
+          <w:rFonts w:ascii="Consolas" w:eastAsia="Times New Roman" w:hAnsi="Consolas" w:cs="Times New Roman"/>
+          <w:color w:val="91B3E0"/>
+          <w:sz w:val="21"/>
+          <w:szCs w:val="21"/>
+          <w:lang w:eastAsia="en-IN" w:bidi="hi-IN"/>
+        </w:rPr>
+        <w:t xml:space="preserve"> </w:t>
+      </w:r>
+      <w:proofErr w:type="spellStart"/>
+      <w:r>
+        <w:rPr>
+          <w:rFonts w:ascii="Consolas" w:eastAsia="Times New Roman" w:hAnsi="Consolas" w:cs="Times New Roman"/>
+          <w:i/>
+          <w:iCs/>
+          <w:color w:val="8190A0"/>
+          <w:sz w:val="21"/>
+          <w:szCs w:val="21"/>
+          <w:lang w:eastAsia="en-IN" w:bidi="hi-IN"/>
+        </w:rPr>
+        <w:t>onkeyup</w:t>
+      </w:r>
+      <w:proofErr w:type="spellEnd"/>
+      <w:r>
+        <w:rPr>
+          <w:rFonts w:ascii="Consolas" w:eastAsia="Times New Roman" w:hAnsi="Consolas" w:cs="Times New Roman"/>
+          <w:color w:val="777777"/>
+          <w:sz w:val="21"/>
+          <w:szCs w:val="21"/>
+          <w:lang w:eastAsia="en-IN" w:bidi="hi-IN"/>
+        </w:rPr>
+        <w:t>="</w:t>
+      </w:r>
+      <w:proofErr w:type="gramStart"/>
+      <w:r>
+        <w:rPr>
+          <w:rFonts w:ascii="Consolas" w:eastAsia="Times New Roman" w:hAnsi="Consolas" w:cs="Times New Roman"/>
+          <w:b/>
+          <w:bCs/>
+          <w:color w:val="AA3731"/>
+          <w:sz w:val="21"/>
+          <w:szCs w:val="21"/>
+          <w:lang w:eastAsia="en-IN" w:bidi="hi-IN"/>
+        </w:rPr>
+        <w:t>validate</w:t>
+      </w:r>
+      <w:r>
+        <w:rPr>
+          <w:rFonts w:ascii="Consolas" w:eastAsia="Times New Roman" w:hAnsi="Consolas" w:cs="Times New Roman"/>
+          <w:color w:val="448C27"/>
+          <w:sz w:val="21"/>
+          <w:szCs w:val="21"/>
+          <w:lang w:eastAsia="en-IN" w:bidi="hi-IN"/>
+        </w:rPr>
+        <w:t>(</w:t>
+      </w:r>
+      <w:proofErr w:type="gramEnd"/>
+      <w:r>
+        <w:rPr>
+          <w:rFonts w:ascii="Consolas" w:eastAsia="Times New Roman" w:hAnsi="Consolas" w:cs="Times New Roman"/>
+          <w:color w:val="448C27"/>
+          <w:sz w:val="21"/>
+          <w:szCs w:val="21"/>
+          <w:lang w:eastAsia="en-IN" w:bidi="hi-IN"/>
+        </w:rPr>
+        <w:t>)</w:t>
+      </w:r>
+      <w:r>
+        <w:rPr>
+          <w:rFonts w:ascii="Consolas" w:eastAsia="Times New Roman" w:hAnsi="Consolas" w:cs="Times New Roman"/>
+          <w:color w:val="777777"/>
+          <w:sz w:val="21"/>
+          <w:szCs w:val="21"/>
+          <w:lang w:eastAsia="en-IN" w:bidi="hi-IN"/>
+        </w:rPr>
+        <w:t>"</w:t>
+      </w:r>
+      <w:r>
+        <w:rPr>
+          <w:rFonts w:ascii="Consolas" w:eastAsia="Times New Roman" w:hAnsi="Consolas" w:cs="Times New Roman"/>
+          <w:color w:val="777777"/>
+          <w:sz w:val="21"/>
+          <w:szCs w:val="21"/>
+          <w:lang w:eastAsia="en-IN" w:bidi="hi-IN"/>
+        </w:rPr>
+        <w:t>/&gt; declarative</w:t>
+      </w:r>
+    </w:p>
+    <w:p>
+      <w:pPr>
         <w:tabs>
           <w:tab w:val="left" w:pos="916"/>
           <w:tab w:val="left" w:pos="1832"/>
@@ -4793,48 +4966,6 @@
           <w:lang w:eastAsia="en-IN" w:bidi="hi-IN"/>
         </w:rPr>
       </w:pPr>
-      <w:proofErr w:type="spellStart"/>
-      <w:proofErr w:type="gramStart"/>
-      <w:r>
-        <w:rPr>
-          <w:rFonts w:ascii="Courier New" w:eastAsia="Times New Roman" w:hAnsi="Courier New" w:cs="Courier New"/>
-          <w:sz w:val="20"/>
-          <w:szCs w:val="20"/>
-          <w:lang w:eastAsia="en-IN" w:bidi="hi-IN"/>
-        </w:rPr>
-        <w:t>document.getElementById</w:t>
-      </w:r>
-      <w:proofErr w:type="spellEnd"/>
-      <w:proofErr w:type="gramEnd"/>
-      <w:r>
-        <w:rPr>
-          <w:rFonts w:ascii="Courier New" w:eastAsia="Times New Roman" w:hAnsi="Courier New" w:cs="Courier New"/>
-          <w:sz w:val="20"/>
-          <w:szCs w:val="20"/>
-          <w:lang w:eastAsia="en-IN" w:bidi="hi-IN"/>
-        </w:rPr>
-        <w:t>("</w:t>
-      </w:r>
-      <w:proofErr w:type="spellStart"/>
-      <w:r>
-        <w:rPr>
-          <w:rFonts w:ascii="Courier New" w:eastAsia="Times New Roman" w:hAnsi="Courier New" w:cs="Courier New"/>
-          <w:sz w:val="20"/>
-          <w:szCs w:val="20"/>
-          <w:lang w:eastAsia="en-IN" w:bidi="hi-IN"/>
-        </w:rPr>
-        <w:t>btn</w:t>
-      </w:r>
-      <w:proofErr w:type="spellEnd"/>
-      <w:r>
-        <w:rPr>
-          <w:rFonts w:ascii="Courier New" w:eastAsia="Times New Roman" w:hAnsi="Courier New" w:cs="Courier New"/>
-          <w:sz w:val="20"/>
-          <w:szCs w:val="20"/>
-          <w:lang w:eastAsia="en-IN" w:bidi="hi-IN"/>
-        </w:rPr>
-        <w:t>")</w:t>
-      </w:r>
     </w:p>
     <w:p>
       <w:pPr>
@@ -4864,15 +4995,7 @@
           <w:lang w:eastAsia="en-IN" w:bidi="hi-IN"/>
         </w:rPr>
       </w:pPr>
-      <w:r>
-        <w:rPr>
-          <w:rFonts w:ascii="Courier New" w:eastAsia="Times New Roman" w:hAnsi="Courier New" w:cs="Courier New"/>
-          <w:sz w:val="20"/>
-          <w:szCs w:val="20"/>
-          <w:lang w:eastAsia="en-IN" w:bidi="hi-IN"/>
-        </w:rPr>
-        <w:t xml:space="preserve">        </w:t>
-      </w:r>
+      <w:proofErr w:type="spellStart"/>
       <w:proofErr w:type="gramStart"/>
       <w:r>
         <w:rPr>
@@ -4881,17 +5004,7 @@
           <w:szCs w:val="20"/>
           <w:lang w:eastAsia="en-IN" w:bidi="hi-IN"/>
         </w:rPr>
-        <w:t>.</w:t>
-      </w:r>
-      <w:proofErr w:type="spellStart"/>
-      <w:r>
-        <w:rPr>
-          <w:rFonts w:ascii="Courier New" w:eastAsia="Times New Roman" w:hAnsi="Courier New" w:cs="Courier New"/>
-          <w:sz w:val="20"/>
-          <w:szCs w:val="20"/>
-          <w:lang w:eastAsia="en-IN" w:bidi="hi-IN"/>
-        </w:rPr>
-        <w:t>addEventListener</w:t>
+        <w:t>document.getElementById</w:t>
       </w:r>
       <w:proofErr w:type="spellEnd"/>
       <w:proofErr w:type="gramEnd"/>
@@ -4902,7 +5015,27 @@
           <w:szCs w:val="20"/>
           <w:lang w:eastAsia="en-IN" w:bidi="hi-IN"/>
         </w:rPr>
-        <w:t>("click", () =&gt; {</w:t>
+        <w:t>("</w:t>
+      </w:r>
+      <w:proofErr w:type="spellStart"/>
+      <w:r>
+        <w:rPr>
+          <w:rFonts w:ascii="Courier New" w:eastAsia="Times New Roman" w:hAnsi="Courier New" w:cs="Courier New"/>
+          <w:sz w:val="20"/>
+          <w:szCs w:val="20"/>
+          <w:lang w:eastAsia="en-IN" w:bidi="hi-IN"/>
+        </w:rPr>
+        <w:t>btn</w:t>
+      </w:r>
+      <w:proofErr w:type="spellEnd"/>
+      <w:r>
+        <w:rPr>
+          <w:rFonts w:ascii="Courier New" w:eastAsia="Times New Roman" w:hAnsi="Courier New" w:cs="Courier New"/>
+          <w:sz w:val="20"/>
+          <w:szCs w:val="20"/>
+          <w:lang w:eastAsia="en-IN" w:bidi="hi-IN"/>
+        </w:rPr>
+        <w:t>")</w:t>
       </w:r>
     </w:p>
     <w:p>
@@ -4940,7 +5073,7 @@
           <w:szCs w:val="20"/>
           <w:lang w:eastAsia="en-IN" w:bidi="hi-IN"/>
         </w:rPr>
-        <w:t xml:space="preserve">            </w:t>
+        <w:t xml:space="preserve">        </w:t>
       </w:r>
       <w:proofErr w:type="gramStart"/>
       <w:r>
@@ -4950,8 +5083,19 @@
           <w:szCs w:val="20"/>
           <w:lang w:eastAsia="en-IN" w:bidi="hi-IN"/>
         </w:rPr>
-        <w:t>alert(</w:t>
-      </w:r>
+        <w:t>.</w:t>
+      </w:r>
+      <w:proofErr w:type="spellStart"/>
+      <w:r>
+        <w:rPr>
+          <w:rFonts w:ascii="Courier New" w:eastAsia="Times New Roman" w:hAnsi="Courier New" w:cs="Courier New"/>
+          <w:sz w:val="20"/>
+          <w:szCs w:val="20"/>
+          <w:lang w:eastAsia="en-IN" w:bidi="hi-IN"/>
+        </w:rPr>
+        <w:t>addEventListener</w:t>
+      </w:r>
+      <w:proofErr w:type="spellEnd"/>
       <w:proofErr w:type="gramEnd"/>
       <w:r>
         <w:rPr>
@@ -4960,7 +5104,7 @@
           <w:szCs w:val="20"/>
           <w:lang w:eastAsia="en-IN" w:bidi="hi-IN"/>
         </w:rPr>
-        <w:t>"Button clicked");</w:t>
+        <w:t>("click", () =&gt; {</w:t>
       </w:r>
     </w:p>
     <w:p>
@@ -4998,84 +5142,28 @@
           <w:szCs w:val="20"/>
           <w:lang w:eastAsia="en-IN" w:bidi="hi-IN"/>
         </w:rPr>
-        <w:t xml:space="preserve">        });</w:t>
-      </w:r>
-    </w:p>
-    <w:p>
-      <w:pPr>
-        <w:spacing w:after="0" w:line="240" w:lineRule="auto"/>
-        <w:rPr>
-          <w:rFonts w:ascii="Times New Roman" w:eastAsia="Times New Roman" w:hAnsi="Times New Roman" w:cs="Times New Roman"/>
-          <w:sz w:val="24"/>
-          <w:szCs w:val="24"/>
-          <w:lang w:eastAsia="en-IN" w:bidi="hi-IN"/>
-        </w:rPr>
-      </w:pPr>
-      <w:r>
-        <w:rPr>
-          <w:rFonts w:ascii="Times New Roman" w:eastAsia="Times New Roman" w:hAnsi="Times New Roman" w:cs="Times New Roman"/>
-          <w:sz w:val="24"/>
-          <w:szCs w:val="24"/>
-          <w:lang w:eastAsia="en-IN" w:bidi="hi-IN"/>
-        </w:rPr>
-        <w:pict>
-          <v:rect id="_x0000_i1044" style="width:0;height:1.5pt" o:hralign="center" o:hrstd="t" o:hr="t" fillcolor="#a0a0a0" stroked="f"/>
-        </w:pict>
-      </w:r>
-    </w:p>
-    <w:p>
-      <w:pPr>
-        <w:spacing w:before="100" w:beforeAutospacing="1" w:after="100" w:afterAutospacing="1" w:line="240" w:lineRule="auto"/>
-        <w:outlineLvl w:val="0"/>
-        <w:rPr>
-          <w:rFonts w:ascii="Times New Roman" w:eastAsia="Times New Roman" w:hAnsi="Times New Roman" w:cs="Times New Roman"/>
-          <w:b/>
-          <w:bCs/>
-          <w:kern w:val="36"/>
-          <w:sz w:val="48"/>
-          <w:szCs w:val="48"/>
-          <w:lang w:eastAsia="en-IN" w:bidi="hi-IN"/>
-        </w:rPr>
-      </w:pPr>
-      <w:r>
-        <w:rPr>
-          <w:rFonts w:ascii="Times New Roman" w:eastAsia="Times New Roman" w:hAnsi="Times New Roman" w:cs="Times New Roman"/>
-          <w:b/>
-          <w:bCs/>
-          <w:kern w:val="36"/>
-          <w:sz w:val="48"/>
-          <w:szCs w:val="48"/>
-          <w:lang w:eastAsia="en-IN" w:bidi="hi-IN"/>
-        </w:rPr>
-        <w:t>11. ES6+ Features</w:t>
-      </w:r>
-    </w:p>
-    <w:p>
-      <w:pPr>
-        <w:spacing w:before="100" w:beforeAutospacing="1" w:after="100" w:afterAutospacing="1" w:line="240" w:lineRule="auto"/>
-        <w:outlineLvl w:val="2"/>
-        <w:rPr>
-          <w:rFonts w:ascii="Times New Roman" w:eastAsia="Times New Roman" w:hAnsi="Times New Roman" w:cs="Times New Roman"/>
-          <w:b/>
-          <w:bCs/>
-          <w:sz w:val="27"/>
-          <w:szCs w:val="27"/>
-          <w:lang w:eastAsia="en-IN" w:bidi="hi-IN"/>
-        </w:rPr>
-      </w:pPr>
-      <w:proofErr w:type="spellStart"/>
-      <w:r>
-        <w:rPr>
-          <w:rFonts w:ascii="Times New Roman" w:eastAsia="Times New Roman" w:hAnsi="Times New Roman" w:cs="Times New Roman"/>
-          <w:b/>
-          <w:bCs/>
-          <w:sz w:val="27"/>
-          <w:szCs w:val="27"/>
-          <w:lang w:eastAsia="en-IN" w:bidi="hi-IN"/>
-        </w:rPr>
-        <w:t>Destructuring</w:t>
-      </w:r>
-      <w:proofErr w:type="spellEnd"/>
+        <w:t xml:space="preserve">            </w:t>
+      </w:r>
+      <w:proofErr w:type="gramStart"/>
+      <w:r>
+        <w:rPr>
+          <w:rFonts w:ascii="Courier New" w:eastAsia="Times New Roman" w:hAnsi="Courier New" w:cs="Courier New"/>
+          <w:sz w:val="20"/>
+          <w:szCs w:val="20"/>
+          <w:lang w:eastAsia="en-IN" w:bidi="hi-IN"/>
+        </w:rPr>
+        <w:t>alert(</w:t>
+      </w:r>
+      <w:proofErr w:type="gramEnd"/>
+      <w:r>
+        <w:rPr>
+          <w:rFonts w:ascii="Courier New" w:eastAsia="Times New Roman" w:hAnsi="Courier New" w:cs="Courier New"/>
+          <w:sz w:val="20"/>
+          <w:szCs w:val="20"/>
+          <w:lang w:eastAsia="en-IN" w:bidi="hi-IN"/>
+        </w:rPr>
+        <w:t>"Button clicked");</w:t>
+      </w:r>
     </w:p>
     <w:p>
       <w:pPr>
@@ -5112,30 +5200,10 @@
           <w:szCs w:val="20"/>
           <w:lang w:eastAsia="en-IN" w:bidi="hi-IN"/>
         </w:rPr>
-        <w:t>let [</w:t>
-      </w:r>
-      <w:proofErr w:type="spellStart"/>
-      <w:proofErr w:type="gramStart"/>
-      <w:r>
-        <w:rPr>
-          <w:rFonts w:ascii="Courier New" w:eastAsia="Times New Roman" w:hAnsi="Courier New" w:cs="Courier New"/>
-          <w:sz w:val="20"/>
-          <w:szCs w:val="20"/>
-          <w:lang w:eastAsia="en-IN" w:bidi="hi-IN"/>
-        </w:rPr>
-        <w:t>a,b</w:t>
-      </w:r>
-      <w:proofErr w:type="spellEnd"/>
-      <w:proofErr w:type="gramEnd"/>
-      <w:r>
-        <w:rPr>
-          <w:rFonts w:ascii="Courier New" w:eastAsia="Times New Roman" w:hAnsi="Courier New" w:cs="Courier New"/>
-          <w:sz w:val="20"/>
-          <w:szCs w:val="20"/>
-          <w:lang w:eastAsia="en-IN" w:bidi="hi-IN"/>
-        </w:rPr>
-        <w:t>] = [1,2];</w:t>
-      </w:r>
+        <w:t xml:space="preserve">        });</w:t>
+      </w:r>
+      <w:bookmarkStart w:id="0" w:name="_GoBack"/>
+      <w:bookmarkEnd w:id="0"/>
     </w:p>
     <w:p>
       <w:pPr>
@@ -5155,8 +5223,35 @@
           <w:lang w:eastAsia="en-IN" w:bidi="hi-IN"/>
         </w:rPr>
         <w:pict>
-          <v:rect id="_x0000_i1045" style="width:0;height:1.5pt" o:hralign="center" o:hrstd="t" o:hr="t" fillcolor="#a0a0a0" stroked="f"/>
+          <v:rect id="_x0000_i1044" style="width:0;height:1.5pt" o:hralign="center" o:hrstd="t" o:hr="t" fillcolor="#a0a0a0" stroked="f"/>
         </w:pict>
+      </w:r>
+    </w:p>
+    <w:p>
+      <w:pPr>
+        <w:spacing w:before="100" w:beforeAutospacing="1" w:after="100" w:afterAutospacing="1" w:line="240" w:lineRule="auto"/>
+        <w:outlineLvl w:val="0"/>
+        <w:rPr>
+          <w:rFonts w:ascii="Times New Roman" w:eastAsia="Times New Roman" w:hAnsi="Times New Roman" w:cs="Times New Roman"/>
+          <w:b/>
+          <w:bCs/>
+          <w:kern w:val="36"/>
+          <w:sz w:val="48"/>
+          <w:szCs w:val="48"/>
+          <w:lang w:eastAsia="en-IN" w:bidi="hi-IN"/>
+        </w:rPr>
+      </w:pPr>
+      <w:r>
+        <w:rPr>
+          <w:rFonts w:ascii="Times New Roman" w:eastAsia="Times New Roman" w:hAnsi="Times New Roman" w:cs="Times New Roman"/>
+          <w:b/>
+          <w:bCs/>
+          <w:kern w:val="36"/>
+          <w:sz w:val="48"/>
+          <w:szCs w:val="48"/>
+          <w:lang w:eastAsia="en-IN" w:bidi="hi-IN"/>
+        </w:rPr>
+        <w:t>11. ES6+ Features</w:t>
       </w:r>
     </w:p>
     <w:p>
@@ -5172,6 +5267,7 @@
           <w:lang w:eastAsia="en-IN" w:bidi="hi-IN"/>
         </w:rPr>
       </w:pPr>
+      <w:proofErr w:type="spellStart"/>
       <w:r>
         <w:rPr>
           <w:rFonts w:ascii="Times New Roman" w:eastAsia="Times New Roman" w:hAnsi="Times New Roman" w:cs="Times New Roman"/>
@@ -5181,8 +5277,9 @@
           <w:szCs w:val="27"/>
           <w:lang w:eastAsia="en-IN" w:bidi="hi-IN"/>
         </w:rPr>
-        <w:t>Spread Operator</w:t>
-      </w:r>
+        <w:t>Destructuring</w:t>
+      </w:r>
+      <w:proofErr w:type="spellEnd"/>
     </w:p>
     <w:p>
       <w:pPr>
@@ -5219,27 +5316,76 @@
           <w:szCs w:val="20"/>
           <w:lang w:eastAsia="en-IN" w:bidi="hi-IN"/>
         </w:rPr>
-        <w:t xml:space="preserve">let </w:t>
+        <w:t>let [</w:t>
       </w:r>
       <w:proofErr w:type="spellStart"/>
-      <w:r>
-        <w:rPr>
-          <w:rFonts w:ascii="Courier New" w:eastAsia="Times New Roman" w:hAnsi="Courier New" w:cs="Courier New"/>
-          <w:sz w:val="20"/>
-          <w:szCs w:val="20"/>
-          <w:lang w:eastAsia="en-IN" w:bidi="hi-IN"/>
-        </w:rPr>
-        <w:t>arr</w:t>
+      <w:proofErr w:type="gramStart"/>
+      <w:r>
+        <w:rPr>
+          <w:rFonts w:ascii="Courier New" w:eastAsia="Times New Roman" w:hAnsi="Courier New" w:cs="Courier New"/>
+          <w:sz w:val="20"/>
+          <w:szCs w:val="20"/>
+          <w:lang w:eastAsia="en-IN" w:bidi="hi-IN"/>
+        </w:rPr>
+        <w:t>a,b</w:t>
       </w:r>
       <w:proofErr w:type="spellEnd"/>
-      <w:r>
-        <w:rPr>
-          <w:rFonts w:ascii="Courier New" w:eastAsia="Times New Roman" w:hAnsi="Courier New" w:cs="Courier New"/>
-          <w:sz w:val="20"/>
-          <w:szCs w:val="20"/>
-          <w:lang w:eastAsia="en-IN" w:bidi="hi-IN"/>
-        </w:rPr>
-        <w:t xml:space="preserve"> = [1,2];</w:t>
+      <w:proofErr w:type="gramEnd"/>
+      <w:r>
+        <w:rPr>
+          <w:rFonts w:ascii="Courier New" w:eastAsia="Times New Roman" w:hAnsi="Courier New" w:cs="Courier New"/>
+          <w:sz w:val="20"/>
+          <w:szCs w:val="20"/>
+          <w:lang w:eastAsia="en-IN" w:bidi="hi-IN"/>
+        </w:rPr>
+        <w:t>] = [1,2];</w:t>
+      </w:r>
+    </w:p>
+    <w:p>
+      <w:pPr>
+        <w:spacing w:after="0" w:line="240" w:lineRule="auto"/>
+        <w:rPr>
+          <w:rFonts w:ascii="Times New Roman" w:eastAsia="Times New Roman" w:hAnsi="Times New Roman" w:cs="Times New Roman"/>
+          <w:sz w:val="24"/>
+          <w:szCs w:val="24"/>
+          <w:lang w:eastAsia="en-IN" w:bidi="hi-IN"/>
+        </w:rPr>
+      </w:pPr>
+      <w:r>
+        <w:rPr>
+          <w:rFonts w:ascii="Times New Roman" w:eastAsia="Times New Roman" w:hAnsi="Times New Roman" w:cs="Times New Roman"/>
+          <w:sz w:val="24"/>
+          <w:szCs w:val="24"/>
+          <w:lang w:eastAsia="en-IN" w:bidi="hi-IN"/>
+        </w:rPr>
+        <w:pict>
+          <v:rect id="_x0000_i1045" style="width:0;height:1.5pt" o:hralign="center" o:hrstd="t" o:hr="t" fillcolor="#a0a0a0" stroked="f"/>
+        </w:pict>
+      </w:r>
+    </w:p>
+    <w:p>
+      <w:pPr>
+        <w:spacing w:before="100" w:beforeAutospacing="1" w:after="100" w:afterAutospacing="1" w:line="240" w:lineRule="auto"/>
+        <w:outlineLvl w:val="2"/>
+        <w:rPr>
+          <w:rFonts w:ascii="Times New Roman" w:eastAsia="Times New Roman" w:hAnsi="Times New Roman" w:cs="Times New Roman"/>
+          <w:b/>
+          <w:bCs/>
+          <w:sz w:val="27"/>
+          <w:szCs w:val="27"/>
+          <w:lang w:eastAsia="en-IN" w:bidi="hi-IN"/>
+        </w:rPr>
+      </w:pPr>
+      <w:r>
+        <w:rPr>
+          <w:rFonts w:ascii="Times New Roman" w:eastAsia="Times New Roman" w:hAnsi="Times New Roman" w:cs="Times New Roman"/>
+          <w:b/>
+          <w:bCs/>
+          <w:sz w:val="27"/>
+          <w:szCs w:val="27"/>
+          <w:lang w:eastAsia="en-IN" w:bidi="hi-IN"/>
+        </w:rPr>
+        <w:t>Spread Operator</w:t>
       </w:r>
     </w:p>
     <w:p>
@@ -5287,7 +5433,7 @@
           <w:szCs w:val="20"/>
           <w:lang w:eastAsia="en-IN" w:bidi="hi-IN"/>
         </w:rPr>
-        <w:t>newArr</w:t>
+        <w:t>arr</w:t>
       </w:r>
       <w:proofErr w:type="spellEnd"/>
       <w:r>
@@ -5297,54 +5443,7 @@
           <w:szCs w:val="20"/>
           <w:lang w:eastAsia="en-IN" w:bidi="hi-IN"/>
         </w:rPr>
-        <w:t xml:space="preserve"> = [...arr,3];</w:t>
-      </w:r>
-    </w:p>
-    <w:p>
-      <w:pPr>
-        <w:spacing w:after="0" w:line="240" w:lineRule="auto"/>
-        <w:rPr>
-          <w:rFonts w:ascii="Times New Roman" w:eastAsia="Times New Roman" w:hAnsi="Times New Roman" w:cs="Times New Roman"/>
-          <w:sz w:val="24"/>
-          <w:szCs w:val="24"/>
-          <w:lang w:eastAsia="en-IN" w:bidi="hi-IN"/>
-        </w:rPr>
-      </w:pPr>
-      <w:r>
-        <w:rPr>
-          <w:rFonts w:ascii="Times New Roman" w:eastAsia="Times New Roman" w:hAnsi="Times New Roman" w:cs="Times New Roman"/>
-          <w:sz w:val="24"/>
-          <w:szCs w:val="24"/>
-          <w:lang w:eastAsia="en-IN" w:bidi="hi-IN"/>
-        </w:rPr>
-        <w:pict>
-          <v:rect id="_x0000_i1046" style="width:0;height:1.5pt" o:hralign="center" o:hrstd="t" o:hr="t" fillcolor="#a0a0a0" stroked="f"/>
-        </w:pict>
-      </w:r>
-    </w:p>
-    <w:p>
-      <w:pPr>
-        <w:spacing w:before="100" w:beforeAutospacing="1" w:after="100" w:afterAutospacing="1" w:line="240" w:lineRule="auto"/>
-        <w:outlineLvl w:val="2"/>
-        <w:rPr>
-          <w:rFonts w:ascii="Times New Roman" w:eastAsia="Times New Roman" w:hAnsi="Times New Roman" w:cs="Times New Roman"/>
-          <w:b/>
-          <w:bCs/>
-          <w:sz w:val="27"/>
-          <w:szCs w:val="27"/>
-          <w:lang w:eastAsia="en-IN" w:bidi="hi-IN"/>
-        </w:rPr>
-      </w:pPr>
-      <w:r>
-        <w:rPr>
-          <w:rFonts w:ascii="Times New Roman" w:eastAsia="Times New Roman" w:hAnsi="Times New Roman" w:cs="Times New Roman"/>
-          <w:b/>
-          <w:bCs/>
-          <w:sz w:val="27"/>
-          <w:szCs w:val="27"/>
-          <w:lang w:eastAsia="en-IN" w:bidi="hi-IN"/>
-        </w:rPr>
-        <w:t>Template Literals</w:t>
+        <w:t xml:space="preserve"> = [1,2];</w:t>
       </w:r>
     </w:p>
     <w:p>
@@ -5382,7 +5481,74 @@
           <w:szCs w:val="20"/>
           <w:lang w:eastAsia="en-IN" w:bidi="hi-IN"/>
         </w:rPr>
-        <w:t>let name = "John";</w:t>
+        <w:t xml:space="preserve">let </w:t>
+      </w:r>
+      <w:proofErr w:type="spellStart"/>
+      <w:r>
+        <w:rPr>
+          <w:rFonts w:ascii="Courier New" w:eastAsia="Times New Roman" w:hAnsi="Courier New" w:cs="Courier New"/>
+          <w:sz w:val="20"/>
+          <w:szCs w:val="20"/>
+          <w:lang w:eastAsia="en-IN" w:bidi="hi-IN"/>
+        </w:rPr>
+        <w:t>newArr</w:t>
+      </w:r>
+      <w:proofErr w:type="spellEnd"/>
+      <w:r>
+        <w:rPr>
+          <w:rFonts w:ascii="Courier New" w:eastAsia="Times New Roman" w:hAnsi="Courier New" w:cs="Courier New"/>
+          <w:sz w:val="20"/>
+          <w:szCs w:val="20"/>
+          <w:lang w:eastAsia="en-IN" w:bidi="hi-IN"/>
+        </w:rPr>
+        <w:t xml:space="preserve"> = [...arr,3];</w:t>
+      </w:r>
+    </w:p>
+    <w:p>
+      <w:pPr>
+        <w:spacing w:after="0" w:line="240" w:lineRule="auto"/>
+        <w:rPr>
+          <w:rFonts w:ascii="Times New Roman" w:eastAsia="Times New Roman" w:hAnsi="Times New Roman" w:cs="Times New Roman"/>
+          <w:sz w:val="24"/>
+          <w:szCs w:val="24"/>
+          <w:lang w:eastAsia="en-IN" w:bidi="hi-IN"/>
+        </w:rPr>
+      </w:pPr>
+      <w:r>
+        <w:rPr>
+          <w:rFonts w:ascii="Times New Roman" w:eastAsia="Times New Roman" w:hAnsi="Times New Roman" w:cs="Times New Roman"/>
+          <w:sz w:val="24"/>
+          <w:szCs w:val="24"/>
+          <w:lang w:eastAsia="en-IN" w:bidi="hi-IN"/>
+        </w:rPr>
+        <w:pict>
+          <v:rect id="_x0000_i1046" style="width:0;height:1.5pt" o:hralign="center" o:hrstd="t" o:hr="t" fillcolor="#a0a0a0" stroked="f"/>
+        </w:pict>
+      </w:r>
+    </w:p>
+    <w:p>
+      <w:pPr>
+        <w:spacing w:before="100" w:beforeAutospacing="1" w:after="100" w:afterAutospacing="1" w:line="240" w:lineRule="auto"/>
+        <w:outlineLvl w:val="2"/>
+        <w:rPr>
+          <w:rFonts w:ascii="Times New Roman" w:eastAsia="Times New Roman" w:hAnsi="Times New Roman" w:cs="Times New Roman"/>
+          <w:b/>
+          <w:bCs/>
+          <w:sz w:val="27"/>
+          <w:szCs w:val="27"/>
+          <w:lang w:eastAsia="en-IN" w:bidi="hi-IN"/>
+        </w:rPr>
+      </w:pPr>
+      <w:r>
+        <w:rPr>
+          <w:rFonts w:ascii="Times New Roman" w:eastAsia="Times New Roman" w:hAnsi="Times New Roman" w:cs="Times New Roman"/>
+          <w:b/>
+          <w:bCs/>
+          <w:sz w:val="27"/>
+          <w:szCs w:val="27"/>
+          <w:lang w:eastAsia="en-IN" w:bidi="hi-IN"/>
+        </w:rPr>
+        <w:t>Template Literals</w:t>
       </w:r>
     </w:p>
     <w:p>
@@ -5413,103 +5579,15 @@
           <w:lang w:eastAsia="en-IN" w:bidi="hi-IN"/>
         </w:rPr>
       </w:pPr>
-      <w:proofErr w:type="gramStart"/>
-      <w:r>
-        <w:rPr>
-          <w:rFonts w:ascii="Courier New" w:eastAsia="Times New Roman" w:hAnsi="Courier New" w:cs="Courier New"/>
-          <w:sz w:val="20"/>
-          <w:szCs w:val="20"/>
-          <w:lang w:eastAsia="en-IN" w:bidi="hi-IN"/>
-        </w:rPr>
-        <w:t>console.log(</w:t>
-      </w:r>
-      <w:proofErr w:type="gramEnd"/>
-      <w:r>
-        <w:rPr>
-          <w:rFonts w:ascii="Courier New" w:eastAsia="Times New Roman" w:hAnsi="Courier New" w:cs="Courier New"/>
-          <w:sz w:val="20"/>
-          <w:szCs w:val="20"/>
-          <w:lang w:eastAsia="en-IN" w:bidi="hi-IN"/>
-        </w:rPr>
-        <w:t>`Hello ${name}`);</w:t>
-      </w:r>
-    </w:p>
-    <w:p>
-      <w:pPr>
-        <w:spacing w:after="0" w:line="240" w:lineRule="auto"/>
-        <w:rPr>
-          <w:rFonts w:ascii="Times New Roman" w:eastAsia="Times New Roman" w:hAnsi="Times New Roman" w:cs="Times New Roman"/>
-          <w:sz w:val="24"/>
-          <w:szCs w:val="24"/>
-          <w:lang w:eastAsia="en-IN" w:bidi="hi-IN"/>
-        </w:rPr>
-      </w:pPr>
-      <w:r>
-        <w:rPr>
-          <w:rFonts w:ascii="Times New Roman" w:eastAsia="Times New Roman" w:hAnsi="Times New Roman" w:cs="Times New Roman"/>
-          <w:sz w:val="24"/>
-          <w:szCs w:val="24"/>
-          <w:lang w:eastAsia="en-IN" w:bidi="hi-IN"/>
-        </w:rPr>
-        <w:pict>
-          <v:rect id="_x0000_i1047" style="width:0;height:1.5pt" o:hralign="center" o:hrstd="t" o:hr="t" fillcolor="#a0a0a0" stroked="f"/>
-        </w:pict>
-      </w:r>
-    </w:p>
-    <w:p>
-      <w:pPr>
-        <w:spacing w:before="100" w:beforeAutospacing="1" w:after="100" w:afterAutospacing="1" w:line="240" w:lineRule="auto"/>
-        <w:outlineLvl w:val="0"/>
-        <w:rPr>
-          <w:rFonts w:ascii="Times New Roman" w:eastAsia="Times New Roman" w:hAnsi="Times New Roman" w:cs="Times New Roman"/>
-          <w:b/>
-          <w:bCs/>
-          <w:kern w:val="36"/>
-          <w:sz w:val="48"/>
-          <w:szCs w:val="48"/>
-          <w:lang w:eastAsia="en-IN" w:bidi="hi-IN"/>
-        </w:rPr>
-      </w:pPr>
-      <w:r>
-        <w:rPr>
-          <w:rFonts w:ascii="Times New Roman" w:eastAsia="Times New Roman" w:hAnsi="Times New Roman" w:cs="Times New Roman"/>
-          <w:b/>
-          <w:bCs/>
-          <w:kern w:val="36"/>
-          <w:sz w:val="48"/>
-          <w:szCs w:val="48"/>
-          <w:lang w:eastAsia="en-IN" w:bidi="hi-IN"/>
-        </w:rPr>
-        <w:lastRenderedPageBreak/>
-        <w:t>12. Asynchronous JavaScript</w:t>
-      </w:r>
-    </w:p>
-    <w:p>
-      <w:pPr>
-        <w:spacing w:before="100" w:beforeAutospacing="1" w:after="100" w:afterAutospacing="1" w:line="240" w:lineRule="auto"/>
-        <w:outlineLvl w:val="1"/>
-        <w:rPr>
-          <w:rFonts w:ascii="Times New Roman" w:eastAsia="Times New Roman" w:hAnsi="Times New Roman" w:cs="Times New Roman"/>
-          <w:b/>
-          <w:bCs/>
-          <w:sz w:val="36"/>
-          <w:szCs w:val="36"/>
-          <w:lang w:eastAsia="en-IN" w:bidi="hi-IN"/>
-        </w:rPr>
-      </w:pPr>
-      <w:proofErr w:type="spellStart"/>
-      <w:r>
-        <w:rPr>
-          <w:rFonts w:ascii="Times New Roman" w:eastAsia="Times New Roman" w:hAnsi="Times New Roman" w:cs="Times New Roman"/>
-          <w:b/>
-          <w:bCs/>
-          <w:sz w:val="36"/>
-          <w:szCs w:val="36"/>
-          <w:lang w:eastAsia="en-IN" w:bidi="hi-IN"/>
-        </w:rPr>
-        <w:t>Callback</w:t>
-      </w:r>
-      <w:proofErr w:type="spellEnd"/>
+      <w:r>
+        <w:rPr>
+          <w:rFonts w:ascii="Courier New" w:eastAsia="Times New Roman" w:hAnsi="Courier New" w:cs="Courier New"/>
+          <w:sz w:val="20"/>
+          <w:szCs w:val="20"/>
+          <w:lang w:eastAsia="en-IN" w:bidi="hi-IN"/>
+        </w:rPr>
+        <w:t>let name = "John";</w:t>
+      </w:r>
     </w:p>
     <w:p>
       <w:pPr>
@@ -5539,37 +5617,103 @@
           <w:lang w:eastAsia="en-IN" w:bidi="hi-IN"/>
         </w:rPr>
       </w:pPr>
+      <w:proofErr w:type="gramStart"/>
+      <w:r>
+        <w:rPr>
+          <w:rFonts w:ascii="Courier New" w:eastAsia="Times New Roman" w:hAnsi="Courier New" w:cs="Courier New"/>
+          <w:sz w:val="20"/>
+          <w:szCs w:val="20"/>
+          <w:lang w:eastAsia="en-IN" w:bidi="hi-IN"/>
+        </w:rPr>
+        <w:lastRenderedPageBreak/>
+        <w:t>console.log(</w:t>
+      </w:r>
+      <w:proofErr w:type="gramEnd"/>
+      <w:r>
+        <w:rPr>
+          <w:rFonts w:ascii="Courier New" w:eastAsia="Times New Roman" w:hAnsi="Courier New" w:cs="Courier New"/>
+          <w:sz w:val="20"/>
+          <w:szCs w:val="20"/>
+          <w:lang w:eastAsia="en-IN" w:bidi="hi-IN"/>
+        </w:rPr>
+        <w:t>`Hello ${name}`);</w:t>
+      </w:r>
+    </w:p>
+    <w:p>
+      <w:pPr>
+        <w:spacing w:after="0" w:line="240" w:lineRule="auto"/>
+        <w:rPr>
+          <w:rFonts w:ascii="Times New Roman" w:eastAsia="Times New Roman" w:hAnsi="Times New Roman" w:cs="Times New Roman"/>
+          <w:sz w:val="24"/>
+          <w:szCs w:val="24"/>
+          <w:lang w:eastAsia="en-IN" w:bidi="hi-IN"/>
+        </w:rPr>
+      </w:pPr>
+      <w:r>
+        <w:rPr>
+          <w:rFonts w:ascii="Times New Roman" w:eastAsia="Times New Roman" w:hAnsi="Times New Roman" w:cs="Times New Roman"/>
+          <w:sz w:val="24"/>
+          <w:szCs w:val="24"/>
+          <w:lang w:eastAsia="en-IN" w:bidi="hi-IN"/>
+        </w:rPr>
+        <w:pict>
+          <v:rect id="_x0000_i1047" style="width:0;height:1.5pt" o:hralign="center" o:hrstd="t" o:hr="t" fillcolor="#a0a0a0" stroked="f"/>
+        </w:pict>
+      </w:r>
+    </w:p>
+    <w:p>
+      <w:pPr>
+        <w:spacing w:before="100" w:beforeAutospacing="1" w:after="100" w:afterAutospacing="1" w:line="240" w:lineRule="auto"/>
+        <w:outlineLvl w:val="0"/>
+        <w:rPr>
+          <w:rFonts w:ascii="Times New Roman" w:eastAsia="Times New Roman" w:hAnsi="Times New Roman" w:cs="Times New Roman"/>
+          <w:b/>
+          <w:bCs/>
+          <w:kern w:val="36"/>
+          <w:sz w:val="48"/>
+          <w:szCs w:val="48"/>
+          <w:lang w:eastAsia="en-IN" w:bidi="hi-IN"/>
+        </w:rPr>
+      </w:pPr>
+      <w:r>
+        <w:rPr>
+          <w:rFonts w:ascii="Times New Roman" w:eastAsia="Times New Roman" w:hAnsi="Times New Roman" w:cs="Times New Roman"/>
+          <w:b/>
+          <w:bCs/>
+          <w:kern w:val="36"/>
+          <w:sz w:val="48"/>
+          <w:szCs w:val="48"/>
+          <w:lang w:eastAsia="en-IN" w:bidi="hi-IN"/>
+        </w:rPr>
+        <w:t>12. Asynchronous JavaScript</w:t>
+      </w:r>
+    </w:p>
+    <w:p>
+      <w:pPr>
+        <w:spacing w:before="100" w:beforeAutospacing="1" w:after="100" w:afterAutospacing="1" w:line="240" w:lineRule="auto"/>
+        <w:outlineLvl w:val="1"/>
+        <w:rPr>
+          <w:rFonts w:ascii="Times New Roman" w:eastAsia="Times New Roman" w:hAnsi="Times New Roman" w:cs="Times New Roman"/>
+          <w:b/>
+          <w:bCs/>
+          <w:sz w:val="36"/>
+          <w:szCs w:val="36"/>
+          <w:lang w:eastAsia="en-IN" w:bidi="hi-IN"/>
+        </w:rPr>
+      </w:pPr>
       <w:proofErr w:type="spellStart"/>
-      <w:proofErr w:type="gramStart"/>
-      <w:r>
-        <w:rPr>
-          <w:rFonts w:ascii="Courier New" w:eastAsia="Times New Roman" w:hAnsi="Courier New" w:cs="Courier New"/>
-          <w:sz w:val="20"/>
-          <w:szCs w:val="20"/>
-          <w:lang w:eastAsia="en-IN" w:bidi="hi-IN"/>
-        </w:rPr>
-        <w:t>setTimeout</w:t>
+      <w:r>
+        <w:rPr>
+          <w:rFonts w:ascii="Times New Roman" w:eastAsia="Times New Roman" w:hAnsi="Times New Roman" w:cs="Times New Roman"/>
+          <w:b/>
+          <w:bCs/>
+          <w:sz w:val="36"/>
+          <w:szCs w:val="36"/>
+          <w:lang w:eastAsia="en-IN" w:bidi="hi-IN"/>
+        </w:rPr>
+        <w:t>Callback</w:t>
       </w:r>
       <w:proofErr w:type="spellEnd"/>
-      <w:r>
-        <w:rPr>
-          <w:rFonts w:ascii="Courier New" w:eastAsia="Times New Roman" w:hAnsi="Courier New" w:cs="Courier New"/>
-          <w:sz w:val="20"/>
-          <w:szCs w:val="20"/>
-          <w:lang w:eastAsia="en-IN" w:bidi="hi-IN"/>
-        </w:rPr>
-        <w:t>(</w:t>
-      </w:r>
-      <w:proofErr w:type="gramEnd"/>
-      <w:r>
-        <w:rPr>
-          <w:rFonts w:ascii="Courier New" w:eastAsia="Times New Roman" w:hAnsi="Courier New" w:cs="Courier New"/>
-          <w:sz w:val="20"/>
-          <w:szCs w:val="20"/>
-          <w:lang w:eastAsia="en-IN" w:bidi="hi-IN"/>
-        </w:rPr>
-        <w:t>() =&gt; {</w:t>
-      </w:r>
     </w:p>
     <w:p>
       <w:pPr>
@@ -5599,14 +5743,36 @@
           <w:lang w:eastAsia="en-IN" w:bidi="hi-IN"/>
         </w:rPr>
       </w:pPr>
-      <w:r>
-        <w:rPr>
-          <w:rFonts w:ascii="Courier New" w:eastAsia="Times New Roman" w:hAnsi="Courier New" w:cs="Courier New"/>
-          <w:sz w:val="20"/>
-          <w:szCs w:val="20"/>
-          <w:lang w:eastAsia="en-IN" w:bidi="hi-IN"/>
-        </w:rPr>
-        <w:t xml:space="preserve">    console.log("Hello");</w:t>
+      <w:proofErr w:type="spellStart"/>
+      <w:proofErr w:type="gramStart"/>
+      <w:r>
+        <w:rPr>
+          <w:rFonts w:ascii="Courier New" w:eastAsia="Times New Roman" w:hAnsi="Courier New" w:cs="Courier New"/>
+          <w:sz w:val="20"/>
+          <w:szCs w:val="20"/>
+          <w:lang w:eastAsia="en-IN" w:bidi="hi-IN"/>
+        </w:rPr>
+        <w:t>setTimeout</w:t>
+      </w:r>
+      <w:proofErr w:type="spellEnd"/>
+      <w:r>
+        <w:rPr>
+          <w:rFonts w:ascii="Courier New" w:eastAsia="Times New Roman" w:hAnsi="Courier New" w:cs="Courier New"/>
+          <w:sz w:val="20"/>
+          <w:szCs w:val="20"/>
+          <w:lang w:eastAsia="en-IN" w:bidi="hi-IN"/>
+        </w:rPr>
+        <w:t>(</w:t>
+      </w:r>
+      <w:proofErr w:type="gramEnd"/>
+      <w:r>
+        <w:rPr>
+          <w:rFonts w:ascii="Courier New" w:eastAsia="Times New Roman" w:hAnsi="Courier New" w:cs="Courier New"/>
+          <w:sz w:val="20"/>
+          <w:szCs w:val="20"/>
+          <w:lang w:eastAsia="en-IN" w:bidi="hi-IN"/>
+        </w:rPr>
+        <w:t>() =&gt; {</w:t>
       </w:r>
     </w:p>
     <w:p>
@@ -5644,54 +5810,7 @@
           <w:szCs w:val="20"/>
           <w:lang w:eastAsia="en-IN" w:bidi="hi-IN"/>
         </w:rPr>
-        <w:t>}, 1000);</w:t>
-      </w:r>
-    </w:p>
-    <w:p>
-      <w:pPr>
-        <w:spacing w:after="0" w:line="240" w:lineRule="auto"/>
-        <w:rPr>
-          <w:rFonts w:ascii="Times New Roman" w:eastAsia="Times New Roman" w:hAnsi="Times New Roman" w:cs="Times New Roman"/>
-          <w:sz w:val="24"/>
-          <w:szCs w:val="24"/>
-          <w:lang w:eastAsia="en-IN" w:bidi="hi-IN"/>
-        </w:rPr>
-      </w:pPr>
-      <w:r>
-        <w:rPr>
-          <w:rFonts w:ascii="Times New Roman" w:eastAsia="Times New Roman" w:hAnsi="Times New Roman" w:cs="Times New Roman"/>
-          <w:sz w:val="24"/>
-          <w:szCs w:val="24"/>
-          <w:lang w:eastAsia="en-IN" w:bidi="hi-IN"/>
-        </w:rPr>
-        <w:pict>
-          <v:rect id="_x0000_i1048" style="width:0;height:1.5pt" o:hralign="center" o:hrstd="t" o:hr="t" fillcolor="#a0a0a0" stroked="f"/>
-        </w:pict>
-      </w:r>
-    </w:p>
-    <w:p>
-      <w:pPr>
-        <w:spacing w:before="100" w:beforeAutospacing="1" w:after="100" w:afterAutospacing="1" w:line="240" w:lineRule="auto"/>
-        <w:outlineLvl w:val="1"/>
-        <w:rPr>
-          <w:rFonts w:ascii="Times New Roman" w:eastAsia="Times New Roman" w:hAnsi="Times New Roman" w:cs="Times New Roman"/>
-          <w:b/>
-          <w:bCs/>
-          <w:sz w:val="36"/>
-          <w:szCs w:val="36"/>
-          <w:lang w:eastAsia="en-IN" w:bidi="hi-IN"/>
-        </w:rPr>
-      </w:pPr>
-      <w:r>
-        <w:rPr>
-          <w:rFonts w:ascii="Times New Roman" w:eastAsia="Times New Roman" w:hAnsi="Times New Roman" w:cs="Times New Roman"/>
-          <w:b/>
-          <w:bCs/>
-          <w:sz w:val="36"/>
-          <w:szCs w:val="36"/>
-          <w:lang w:eastAsia="en-IN" w:bidi="hi-IN"/>
-        </w:rPr>
-        <w:t>Promise</w:t>
+        <w:t xml:space="preserve">    console.log("Hello");</w:t>
       </w:r>
     </w:p>
     <w:p>
@@ -5729,27 +5848,54 @@
           <w:szCs w:val="20"/>
           <w:lang w:eastAsia="en-IN" w:bidi="hi-IN"/>
         </w:rPr>
-        <w:t xml:space="preserve">let promise = new </w:t>
-      </w:r>
-      <w:proofErr w:type="gramStart"/>
-      <w:r>
-        <w:rPr>
-          <w:rFonts w:ascii="Courier New" w:eastAsia="Times New Roman" w:hAnsi="Courier New" w:cs="Courier New"/>
-          <w:sz w:val="20"/>
-          <w:szCs w:val="20"/>
-          <w:lang w:eastAsia="en-IN" w:bidi="hi-IN"/>
-        </w:rPr>
-        <w:t>Promise(</w:t>
-      </w:r>
-      <w:proofErr w:type="gramEnd"/>
-      <w:r>
-        <w:rPr>
-          <w:rFonts w:ascii="Courier New" w:eastAsia="Times New Roman" w:hAnsi="Courier New" w:cs="Courier New"/>
-          <w:sz w:val="20"/>
-          <w:szCs w:val="20"/>
-          <w:lang w:eastAsia="en-IN" w:bidi="hi-IN"/>
-        </w:rPr>
-        <w:t>(resolve, reject) =&gt; {</w:t>
+        <w:t>}, 1000);</w:t>
+      </w:r>
+    </w:p>
+    <w:p>
+      <w:pPr>
+        <w:spacing w:after="0" w:line="240" w:lineRule="auto"/>
+        <w:rPr>
+          <w:rFonts w:ascii="Times New Roman" w:eastAsia="Times New Roman" w:hAnsi="Times New Roman" w:cs="Times New Roman"/>
+          <w:sz w:val="24"/>
+          <w:szCs w:val="24"/>
+          <w:lang w:eastAsia="en-IN" w:bidi="hi-IN"/>
+        </w:rPr>
+      </w:pPr>
+      <w:r>
+        <w:rPr>
+          <w:rFonts w:ascii="Times New Roman" w:eastAsia="Times New Roman" w:hAnsi="Times New Roman" w:cs="Times New Roman"/>
+          <w:sz w:val="24"/>
+          <w:szCs w:val="24"/>
+          <w:lang w:eastAsia="en-IN" w:bidi="hi-IN"/>
+        </w:rPr>
+        <w:pict>
+          <v:rect id="_x0000_i1048" style="width:0;height:1.5pt" o:hralign="center" o:hrstd="t" o:hr="t" fillcolor="#a0a0a0" stroked="f"/>
+        </w:pict>
+      </w:r>
+    </w:p>
+    <w:p>
+      <w:pPr>
+        <w:spacing w:before="100" w:beforeAutospacing="1" w:after="100" w:afterAutospacing="1" w:line="240" w:lineRule="auto"/>
+        <w:outlineLvl w:val="1"/>
+        <w:rPr>
+          <w:rFonts w:ascii="Times New Roman" w:eastAsia="Times New Roman" w:hAnsi="Times New Roman" w:cs="Times New Roman"/>
+          <w:b/>
+          <w:bCs/>
+          <w:sz w:val="36"/>
+          <w:szCs w:val="36"/>
+          <w:lang w:eastAsia="en-IN" w:bidi="hi-IN"/>
+        </w:rPr>
+      </w:pPr>
+      <w:r>
+        <w:rPr>
+          <w:rFonts w:ascii="Times New Roman" w:eastAsia="Times New Roman" w:hAnsi="Times New Roman" w:cs="Times New Roman"/>
+          <w:b/>
+          <w:bCs/>
+          <w:sz w:val="36"/>
+          <w:szCs w:val="36"/>
+          <w:lang w:eastAsia="en-IN" w:bidi="hi-IN"/>
+        </w:rPr>
+        <w:t>Promise</w:t>
       </w:r>
     </w:p>
     <w:p>
@@ -5787,7 +5933,27 @@
           <w:szCs w:val="20"/>
           <w:lang w:eastAsia="en-IN" w:bidi="hi-IN"/>
         </w:rPr>
-        <w:t xml:space="preserve">    resolve("Success");</w:t>
+        <w:t xml:space="preserve">let promise = new </w:t>
+      </w:r>
+      <w:proofErr w:type="gramStart"/>
+      <w:r>
+        <w:rPr>
+          <w:rFonts w:ascii="Courier New" w:eastAsia="Times New Roman" w:hAnsi="Courier New" w:cs="Courier New"/>
+          <w:sz w:val="20"/>
+          <w:szCs w:val="20"/>
+          <w:lang w:eastAsia="en-IN" w:bidi="hi-IN"/>
+        </w:rPr>
+        <w:t>Promise(</w:t>
+      </w:r>
+      <w:proofErr w:type="gramEnd"/>
+      <w:r>
+        <w:rPr>
+          <w:rFonts w:ascii="Courier New" w:eastAsia="Times New Roman" w:hAnsi="Courier New" w:cs="Courier New"/>
+          <w:sz w:val="20"/>
+          <w:szCs w:val="20"/>
+          <w:lang w:eastAsia="en-IN" w:bidi="hi-IN"/>
+        </w:rPr>
+        <w:t>(resolve, reject) =&gt; {</w:t>
       </w:r>
     </w:p>
     <w:p>
@@ -5825,7 +5991,7 @@
           <w:szCs w:val="20"/>
           <w:lang w:eastAsia="en-IN" w:bidi="hi-IN"/>
         </w:rPr>
-        <w:t>});</w:t>
+        <w:t xml:space="preserve">    resolve("Success");</w:t>
       </w:r>
     </w:p>
     <w:p>
@@ -5856,6 +6022,15 @@
           <w:lang w:eastAsia="en-IN" w:bidi="hi-IN"/>
         </w:rPr>
       </w:pPr>
+      <w:r>
+        <w:rPr>
+          <w:rFonts w:ascii="Courier New" w:eastAsia="Times New Roman" w:hAnsi="Courier New" w:cs="Courier New"/>
+          <w:sz w:val="20"/>
+          <w:szCs w:val="20"/>
+          <w:lang w:eastAsia="en-IN" w:bidi="hi-IN"/>
+        </w:rPr>
+        <w:t>});</w:t>
+      </w:r>
     </w:p>
     <w:p>
       <w:pPr>
@@ -5885,88 +6060,6 @@
           <w:lang w:eastAsia="en-IN" w:bidi="hi-IN"/>
         </w:rPr>
       </w:pPr>
-      <w:proofErr w:type="spellStart"/>
-      <w:proofErr w:type="gramStart"/>
-      <w:r>
-        <w:rPr>
-          <w:rFonts w:ascii="Courier New" w:eastAsia="Times New Roman" w:hAnsi="Courier New" w:cs="Courier New"/>
-          <w:sz w:val="20"/>
-          <w:szCs w:val="20"/>
-          <w:lang w:eastAsia="en-IN" w:bidi="hi-IN"/>
-        </w:rPr>
-        <w:t>promise.then</w:t>
-      </w:r>
-      <w:proofErr w:type="spellEnd"/>
-      <w:proofErr w:type="gramEnd"/>
-      <w:r>
-        <w:rPr>
-          <w:rFonts w:ascii="Courier New" w:eastAsia="Times New Roman" w:hAnsi="Courier New" w:cs="Courier New"/>
-          <w:sz w:val="20"/>
-          <w:szCs w:val="20"/>
-          <w:lang w:eastAsia="en-IN" w:bidi="hi-IN"/>
-        </w:rPr>
-        <w:t>(res =&gt; console.log(res));</w:t>
-      </w:r>
-    </w:p>
-    <w:p>
-      <w:pPr>
-        <w:spacing w:after="0" w:line="240" w:lineRule="auto"/>
-        <w:rPr>
-          <w:rFonts w:ascii="Times New Roman" w:eastAsia="Times New Roman" w:hAnsi="Times New Roman" w:cs="Times New Roman"/>
-          <w:sz w:val="24"/>
-          <w:szCs w:val="24"/>
-          <w:lang w:eastAsia="en-IN" w:bidi="hi-IN"/>
-        </w:rPr>
-      </w:pPr>
-      <w:r>
-        <w:rPr>
-          <w:rFonts w:ascii="Times New Roman" w:eastAsia="Times New Roman" w:hAnsi="Times New Roman" w:cs="Times New Roman"/>
-          <w:sz w:val="24"/>
-          <w:szCs w:val="24"/>
-          <w:lang w:eastAsia="en-IN" w:bidi="hi-IN"/>
-        </w:rPr>
-        <w:pict>
-          <v:rect id="_x0000_i1049" style="width:0;height:1.5pt" o:hralign="center" o:hrstd="t" o:hr="t" fillcolor="#a0a0a0" stroked="f"/>
-        </w:pict>
-      </w:r>
-    </w:p>
-    <w:p>
-      <w:pPr>
-        <w:spacing w:before="100" w:beforeAutospacing="1" w:after="100" w:afterAutospacing="1" w:line="240" w:lineRule="auto"/>
-        <w:outlineLvl w:val="1"/>
-        <w:rPr>
-          <w:rFonts w:ascii="Times New Roman" w:eastAsia="Times New Roman" w:hAnsi="Times New Roman" w:cs="Times New Roman"/>
-          <w:b/>
-          <w:bCs/>
-          <w:sz w:val="36"/>
-          <w:szCs w:val="36"/>
-          <w:lang w:eastAsia="en-IN" w:bidi="hi-IN"/>
-        </w:rPr>
-      </w:pPr>
-      <w:proofErr w:type="spellStart"/>
-      <w:r>
-        <w:rPr>
-          <w:rFonts w:ascii="Times New Roman" w:eastAsia="Times New Roman" w:hAnsi="Times New Roman" w:cs="Times New Roman"/>
-          <w:b/>
-          <w:bCs/>
-          <w:sz w:val="36"/>
-          <w:szCs w:val="36"/>
-          <w:lang w:eastAsia="en-IN" w:bidi="hi-IN"/>
-        </w:rPr>
-        <w:t>Async</w:t>
-      </w:r>
-      <w:proofErr w:type="spellEnd"/>
-      <w:r>
-        <w:rPr>
-          <w:rFonts w:ascii="Times New Roman" w:eastAsia="Times New Roman" w:hAnsi="Times New Roman" w:cs="Times New Roman"/>
-          <w:b/>
-          <w:bCs/>
-          <w:sz w:val="36"/>
-          <w:szCs w:val="36"/>
-          <w:lang w:eastAsia="en-IN" w:bidi="hi-IN"/>
-        </w:rPr>
-        <w:t>/Await</w:t>
-      </w:r>
     </w:p>
     <w:p>
       <w:pPr>
@@ -5997,55 +6090,86 @@
         </w:rPr>
       </w:pPr>
       <w:proofErr w:type="spellStart"/>
-      <w:r>
-        <w:rPr>
-          <w:rFonts w:ascii="Courier New" w:eastAsia="Times New Roman" w:hAnsi="Courier New" w:cs="Courier New"/>
-          <w:sz w:val="20"/>
-          <w:szCs w:val="20"/>
-          <w:lang w:eastAsia="en-IN" w:bidi="hi-IN"/>
-        </w:rPr>
-        <w:t>async</w:t>
+      <w:proofErr w:type="gramStart"/>
+      <w:r>
+        <w:rPr>
+          <w:rFonts w:ascii="Courier New" w:eastAsia="Times New Roman" w:hAnsi="Courier New" w:cs="Courier New"/>
+          <w:sz w:val="20"/>
+          <w:szCs w:val="20"/>
+          <w:lang w:eastAsia="en-IN" w:bidi="hi-IN"/>
+        </w:rPr>
+        <w:t>promise.then</w:t>
       </w:r>
       <w:proofErr w:type="spellEnd"/>
-      <w:r>
-        <w:rPr>
-          <w:rFonts w:ascii="Courier New" w:eastAsia="Times New Roman" w:hAnsi="Courier New" w:cs="Courier New"/>
-          <w:sz w:val="20"/>
-          <w:szCs w:val="20"/>
-          <w:lang w:eastAsia="en-IN" w:bidi="hi-IN"/>
-        </w:rPr>
-        <w:t xml:space="preserve"> function </w:t>
-      </w:r>
+      <w:proofErr w:type="gramEnd"/>
+      <w:r>
+        <w:rPr>
+          <w:rFonts w:ascii="Courier New" w:eastAsia="Times New Roman" w:hAnsi="Courier New" w:cs="Courier New"/>
+          <w:sz w:val="20"/>
+          <w:szCs w:val="20"/>
+          <w:lang w:eastAsia="en-IN" w:bidi="hi-IN"/>
+        </w:rPr>
+        <w:t>(res =&gt; console.log(res));</w:t>
+      </w:r>
+    </w:p>
+    <w:p>
+      <w:pPr>
+        <w:spacing w:after="0" w:line="240" w:lineRule="auto"/>
+        <w:rPr>
+          <w:rFonts w:ascii="Times New Roman" w:eastAsia="Times New Roman" w:hAnsi="Times New Roman" w:cs="Times New Roman"/>
+          <w:sz w:val="24"/>
+          <w:szCs w:val="24"/>
+          <w:lang w:eastAsia="en-IN" w:bidi="hi-IN"/>
+        </w:rPr>
+      </w:pPr>
+      <w:r>
+        <w:rPr>
+          <w:rFonts w:ascii="Times New Roman" w:eastAsia="Times New Roman" w:hAnsi="Times New Roman" w:cs="Times New Roman"/>
+          <w:sz w:val="24"/>
+          <w:szCs w:val="24"/>
+          <w:lang w:eastAsia="en-IN" w:bidi="hi-IN"/>
+        </w:rPr>
+        <w:pict>
+          <v:rect id="_x0000_i1049" style="width:0;height:1.5pt" o:hralign="center" o:hrstd="t" o:hr="t" fillcolor="#a0a0a0" stroked="f"/>
+        </w:pict>
+      </w:r>
+    </w:p>
+    <w:p>
+      <w:pPr>
+        <w:spacing w:before="100" w:beforeAutospacing="1" w:after="100" w:afterAutospacing="1" w:line="240" w:lineRule="auto"/>
+        <w:outlineLvl w:val="1"/>
+        <w:rPr>
+          <w:rFonts w:ascii="Times New Roman" w:eastAsia="Times New Roman" w:hAnsi="Times New Roman" w:cs="Times New Roman"/>
+          <w:b/>
+          <w:bCs/>
+          <w:sz w:val="36"/>
+          <w:szCs w:val="36"/>
+          <w:lang w:eastAsia="en-IN" w:bidi="hi-IN"/>
+        </w:rPr>
+      </w:pPr>
       <w:proofErr w:type="spellStart"/>
-      <w:proofErr w:type="gramStart"/>
-      <w:r>
-        <w:rPr>
-          <w:rFonts w:ascii="Courier New" w:eastAsia="Times New Roman" w:hAnsi="Courier New" w:cs="Courier New"/>
-          <w:sz w:val="20"/>
-          <w:szCs w:val="20"/>
-          <w:lang w:eastAsia="en-IN" w:bidi="hi-IN"/>
-        </w:rPr>
-        <w:t>fetchData</w:t>
+      <w:r>
+        <w:rPr>
+          <w:rFonts w:ascii="Times New Roman" w:eastAsia="Times New Roman" w:hAnsi="Times New Roman" w:cs="Times New Roman"/>
+          <w:b/>
+          <w:bCs/>
+          <w:sz w:val="36"/>
+          <w:szCs w:val="36"/>
+          <w:lang w:eastAsia="en-IN" w:bidi="hi-IN"/>
+        </w:rPr>
+        <w:t>Async</w:t>
       </w:r>
       <w:proofErr w:type="spellEnd"/>
       <w:r>
         <w:rPr>
-          <w:rFonts w:ascii="Courier New" w:eastAsia="Times New Roman" w:hAnsi="Courier New" w:cs="Courier New"/>
-          <w:sz w:val="20"/>
-          <w:szCs w:val="20"/>
-          <w:lang w:eastAsia="en-IN" w:bidi="hi-IN"/>
-        </w:rPr>
-        <w:t>(</w:t>
-      </w:r>
-      <w:proofErr w:type="gramEnd"/>
-      <w:r>
-        <w:rPr>
-          <w:rFonts w:ascii="Courier New" w:eastAsia="Times New Roman" w:hAnsi="Courier New" w:cs="Courier New"/>
-          <w:sz w:val="20"/>
-          <w:szCs w:val="20"/>
-          <w:lang w:eastAsia="en-IN" w:bidi="hi-IN"/>
-        </w:rPr>
-        <w:t>){</w:t>
+          <w:rFonts w:ascii="Times New Roman" w:eastAsia="Times New Roman" w:hAnsi="Times New Roman" w:cs="Times New Roman"/>
+          <w:b/>
+          <w:bCs/>
+          <w:sz w:val="36"/>
+          <w:szCs w:val="36"/>
+          <w:lang w:eastAsia="en-IN" w:bidi="hi-IN"/>
+        </w:rPr>
+        <w:t>/Await</w:t>
       </w:r>
     </w:p>
     <w:p>
@@ -6076,14 +6200,56 @@
           <w:lang w:eastAsia="en-IN" w:bidi="hi-IN"/>
         </w:rPr>
       </w:pPr>
-      <w:r>
-        <w:rPr>
-          <w:rFonts w:ascii="Courier New" w:eastAsia="Times New Roman" w:hAnsi="Courier New" w:cs="Courier New"/>
-          <w:sz w:val="20"/>
-          <w:szCs w:val="20"/>
-          <w:lang w:eastAsia="en-IN" w:bidi="hi-IN"/>
-        </w:rPr>
-        <w:t xml:space="preserve">    let res = await fetch("https://api.example.com");</w:t>
+      <w:proofErr w:type="spellStart"/>
+      <w:r>
+        <w:rPr>
+          <w:rFonts w:ascii="Courier New" w:eastAsia="Times New Roman" w:hAnsi="Courier New" w:cs="Courier New"/>
+          <w:sz w:val="20"/>
+          <w:szCs w:val="20"/>
+          <w:lang w:eastAsia="en-IN" w:bidi="hi-IN"/>
+        </w:rPr>
+        <w:t>async</w:t>
+      </w:r>
+      <w:proofErr w:type="spellEnd"/>
+      <w:r>
+        <w:rPr>
+          <w:rFonts w:ascii="Courier New" w:eastAsia="Times New Roman" w:hAnsi="Courier New" w:cs="Courier New"/>
+          <w:sz w:val="20"/>
+          <w:szCs w:val="20"/>
+          <w:lang w:eastAsia="en-IN" w:bidi="hi-IN"/>
+        </w:rPr>
+        <w:t xml:space="preserve"> function </w:t>
+      </w:r>
+      <w:proofErr w:type="spellStart"/>
+      <w:proofErr w:type="gramStart"/>
+      <w:r>
+        <w:rPr>
+          <w:rFonts w:ascii="Courier New" w:eastAsia="Times New Roman" w:hAnsi="Courier New" w:cs="Courier New"/>
+          <w:sz w:val="20"/>
+          <w:szCs w:val="20"/>
+          <w:lang w:eastAsia="en-IN" w:bidi="hi-IN"/>
+        </w:rPr>
+        <w:t>fetchData</w:t>
+      </w:r>
+      <w:proofErr w:type="spellEnd"/>
+      <w:r>
+        <w:rPr>
+          <w:rFonts w:ascii="Courier New" w:eastAsia="Times New Roman" w:hAnsi="Courier New" w:cs="Courier New"/>
+          <w:sz w:val="20"/>
+          <w:szCs w:val="20"/>
+          <w:lang w:eastAsia="en-IN" w:bidi="hi-IN"/>
+        </w:rPr>
+        <w:t>(</w:t>
+      </w:r>
+      <w:proofErr w:type="gramEnd"/>
+      <w:r>
+        <w:rPr>
+          <w:rFonts w:ascii="Courier New" w:eastAsia="Times New Roman" w:hAnsi="Courier New" w:cs="Courier New"/>
+          <w:sz w:val="20"/>
+          <w:szCs w:val="20"/>
+          <w:lang w:eastAsia="en-IN" w:bidi="hi-IN"/>
+        </w:rPr>
+        <w:t>){</w:t>
       </w:r>
     </w:p>
     <w:p>
@@ -6121,29 +6287,7 @@
           <w:szCs w:val="20"/>
           <w:lang w:eastAsia="en-IN" w:bidi="hi-IN"/>
         </w:rPr>
-        <w:t xml:space="preserve">    let data = await </w:t>
-      </w:r>
-      <w:proofErr w:type="spellStart"/>
-      <w:proofErr w:type="gramStart"/>
-      <w:r>
-        <w:rPr>
-          <w:rFonts w:ascii="Courier New" w:eastAsia="Times New Roman" w:hAnsi="Courier New" w:cs="Courier New"/>
-          <w:sz w:val="20"/>
-          <w:szCs w:val="20"/>
-          <w:lang w:eastAsia="en-IN" w:bidi="hi-IN"/>
-        </w:rPr>
-        <w:t>res.json</w:t>
-      </w:r>
-      <w:proofErr w:type="spellEnd"/>
-      <w:proofErr w:type="gramEnd"/>
-      <w:r>
-        <w:rPr>
-          <w:rFonts w:ascii="Courier New" w:eastAsia="Times New Roman" w:hAnsi="Courier New" w:cs="Courier New"/>
-          <w:sz w:val="20"/>
-          <w:szCs w:val="20"/>
-          <w:lang w:eastAsia="en-IN" w:bidi="hi-IN"/>
-        </w:rPr>
-        <w:t>();</w:t>
+        <w:t xml:space="preserve">    let res = await fetch("https://api.example.com");</w:t>
       </w:r>
     </w:p>
     <w:p>
@@ -6181,7 +6325,29 @@
           <w:szCs w:val="20"/>
           <w:lang w:eastAsia="en-IN" w:bidi="hi-IN"/>
         </w:rPr>
-        <w:t xml:space="preserve">    console.log(data);</w:t>
+        <w:t xml:space="preserve">    let data = await </w:t>
+      </w:r>
+      <w:proofErr w:type="spellStart"/>
+      <w:proofErr w:type="gramStart"/>
+      <w:r>
+        <w:rPr>
+          <w:rFonts w:ascii="Courier New" w:eastAsia="Times New Roman" w:hAnsi="Courier New" w:cs="Courier New"/>
+          <w:sz w:val="20"/>
+          <w:szCs w:val="20"/>
+          <w:lang w:eastAsia="en-IN" w:bidi="hi-IN"/>
+        </w:rPr>
+        <w:t>res.json</w:t>
+      </w:r>
+      <w:proofErr w:type="spellEnd"/>
+      <w:proofErr w:type="gramEnd"/>
+      <w:r>
+        <w:rPr>
+          <w:rFonts w:ascii="Courier New" w:eastAsia="Times New Roman" w:hAnsi="Courier New" w:cs="Courier New"/>
+          <w:sz w:val="20"/>
+          <w:szCs w:val="20"/>
+          <w:lang w:eastAsia="en-IN" w:bidi="hi-IN"/>
+        </w:rPr>
+        <w:t>();</w:t>
       </w:r>
     </w:p>
     <w:p>
@@ -6219,6 +6385,44 @@
           <w:szCs w:val="20"/>
           <w:lang w:eastAsia="en-IN" w:bidi="hi-IN"/>
         </w:rPr>
+        <w:t xml:space="preserve">    console.log(data);</w:t>
+      </w:r>
+    </w:p>
+    <w:p>
+      <w:pPr>
+        <w:tabs>
+          <w:tab w:val="left" w:pos="916"/>
+          <w:tab w:val="left" w:pos="1832"/>
+          <w:tab w:val="left" w:pos="2748"/>
+          <w:tab w:val="left" w:pos="3664"/>
+          <w:tab w:val="left" w:pos="4580"/>
+          <w:tab w:val="left" w:pos="5496"/>
+          <w:tab w:val="left" w:pos="6412"/>
+          <w:tab w:val="left" w:pos="7328"/>
+          <w:tab w:val="left" w:pos="8244"/>
+          <w:tab w:val="left" w:pos="9160"/>
+          <w:tab w:val="left" w:pos="10076"/>
+          <w:tab w:val="left" w:pos="10992"/>
+          <w:tab w:val="left" w:pos="11908"/>
+          <w:tab w:val="left" w:pos="12824"/>
+          <w:tab w:val="left" w:pos="13740"/>
+          <w:tab w:val="left" w:pos="14656"/>
+        </w:tabs>
+        <w:spacing w:after="0" w:line="240" w:lineRule="auto"/>
+        <w:rPr>
+          <w:rFonts w:ascii="Courier New" w:eastAsia="Times New Roman" w:hAnsi="Courier New" w:cs="Courier New"/>
+          <w:sz w:val="20"/>
+          <w:szCs w:val="20"/>
+          <w:lang w:eastAsia="en-IN" w:bidi="hi-IN"/>
+        </w:rPr>
+      </w:pPr>
+      <w:r>
+        <w:rPr>
+          <w:rFonts w:ascii="Courier New" w:eastAsia="Times New Roman" w:hAnsi="Courier New" w:cs="Courier New"/>
+          <w:sz w:val="20"/>
+          <w:szCs w:val="20"/>
+          <w:lang w:eastAsia="en-IN" w:bidi="hi-IN"/>
+        </w:rPr>
         <w:t>}</w:t>
       </w:r>
     </w:p>
@@ -6295,7 +6499,6 @@
           <w:lang w:eastAsia="en-IN" w:bidi="hi-IN"/>
         </w:rPr>
       </w:pPr>
-      <w:bookmarkStart w:id="0" w:name="_GoBack"/>
       <w:r>
         <w:rPr>
           <w:rFonts w:ascii="Times New Roman" w:eastAsia="Times New Roman" w:hAnsi="Times New Roman" w:cs="Times New Roman"/>
@@ -6354,7 +6557,6 @@
           </wp:inline>
         </w:drawing>
       </w:r>
-      <w:bookmarkEnd w:id="0"/>
     </w:p>
     <w:p>
       <w:pPr>

</xml_diff>